<commit_message>
Fix partner search: beta header, agentic loop, error surfacing
- Use client.beta.messages.create with betas=['web-search-2025-03-05']
  so the web_search_20250305 tool is properly activated
- Add agentic loop (max 8 turns) to handle tool_use stop_reason
- Collect text only on end_turn to prevent stray '[' in intermediate
  turns from corrupting JSON array extraction
- Return None (not []) on API error so the route shows a red flash
  instead of the misleading "0 partners added" message
- Pre-compile markdown fence regex at module level
- Log stop_reason and block types per turn for easier diagnosis

Co-Authored-By: Claude Sonnet 4.6 <noreply@anthropic.com>
</commit_message>
<xml_diff>
--- a/docs/BAE_Agents_PRD_v1.0.docx
+++ b/docs/BAE_Agents_PRD_v1.0.docx
@@ -16218,7 +16218,7 @@
                 <w:sz w:val="20"/>
                 <w:szCs w:val="20"/>
               </w:rPr>
-              <w:t xml:space="preserve">BAE-AGENT-PARTNER-v1.0</w:t>
+              <w:t xml:space="preserve">BAE-AGENT-PARTNER-v1.1</w:t>
             </w:r>
           </w:p>
         </w:tc>
@@ -16342,7 +16342,7 @@
                 <w:sz w:val="20"/>
                 <w:szCs w:val="20"/>
               </w:rPr>
-              <w:t xml:space="preserve">Weekly + event-driven (new experience published, seasonal push)</w:t>
+              <w:t xml:space="preserve">Weekly + event-driven + admin-initiated web search</w:t>
             </w:r>
           </w:p>
         </w:tc>
@@ -16404,7 +16404,7 @@
                 <w:sz w:val="20"/>
                 <w:szCs w:val="20"/>
               </w:rPr>
-              <w:t xml:space="preserve">Mixed — all outreach drafts require approval; partner CRM tracking autonomous</w:t>
+              <w:t xml:space="preserve">Semi-autonomous — all drafts require approval; web search + CRM import autonomous</w:t>
             </w:r>
           </w:p>
         </w:tc>
@@ -16466,7 +16466,7 @@
                 <w:sz w:val="20"/>
                 <w:szCs w:val="20"/>
               </w:rPr>
-              <w:t xml:space="preserve">Draft personalized outreach emails, generate OTA listing descriptions, track follow-up cadence</w:t>
+              <w:t xml:space="preserve">Search web for partners by city/channel, extract business data, draft outreach, track follow-up</w:t>
             </w:r>
           </w:p>
         </w:tc>
@@ -16499,7 +16499,7 @@
                 <w:sz w:val="20"/>
                 <w:szCs w:val="20"/>
               </w:rPr>
-              <w:t xml:space="preserve">CRM</w:t>
+              <w:t xml:space="preserve">Web Search</w:t>
             </w:r>
           </w:p>
         </w:tc>
@@ -16528,7 +16528,7 @@
                 <w:sz w:val="20"/>
                 <w:szCs w:val="20"/>
               </w:rPr>
-              <w:t xml:space="preserve">Lightweight partner CRM built into admin — no third-party tool needed at this stage</w:t>
+              <w:t xml:space="preserve">Admin initiates from /admin/agents/partnerships/search — Claude uses web_search tool</w:t>
             </w:r>
           </w:p>
         </w:tc>
@@ -16561,7 +16561,7 @@
                 <w:sz w:val="20"/>
                 <w:szCs w:val="20"/>
               </w:rPr>
-              <w:t xml:space="preserve">Admin Surface</w:t>
+              <w:t xml:space="preserve">Auto-Import</w:t>
             </w:r>
           </w:p>
         </w:tc>
@@ -16590,7 +16590,193 @@
                 <w:sz w:val="20"/>
                 <w:szCs w:val="20"/>
               </w:rPr>
-              <w:t xml:space="preserve">/admin/agents/partnerships — partner pipeline + outreach queue + OTA listings</w:t>
+              <w:t xml:space="preserve">Discovered businesses not already in CRM are automatically added as status='prospect'</w:t>
+            </w:r>
+          </w:p>
+        </w:tc>
+      </w:tr>
+      <w:tr>
+        <w:tc>
+          <w:tcPr>
+            <w:tcW w:type="dxa" w:w="4680"/>
+            <w:tcBorders>
+              <w:top w:val="single" w:color="CCCCCC" w:sz="1"/>
+              <w:left w:val="single" w:color="CCCCCC" w:sz="1"/>
+              <w:bottom w:val="single" w:color="CCCCCC" w:sz="1"/>
+              <w:right w:val="single" w:color="CCCCCC" w:sz="1"/>
+            </w:tcBorders>
+            <w:shd w:fill="EFF4F9" w:val="clear"/>
+            <w:tcMar>
+              <w:top w:type="dxa" w:w="60"/>
+              <w:left w:type="dxa" w:w="100"/>
+              <w:bottom w:type="dxa" w:w="60"/>
+              <w:right w:type="dxa" w:w="100"/>
+            </w:tcMar>
+          </w:tcPr>
+          <w:p>
+            <w:r>
+              <w:rPr>
+                <w:rFonts w:ascii="Arial" w:cs="Arial" w:eastAsia="Arial" w:hAnsi="Arial"/>
+                <w:b/>
+                <w:bCs/>
+                <w:color w:val="1A3557"/>
+                <w:sz w:val="20"/>
+                <w:szCs w:val="20"/>
+              </w:rPr>
+              <w:t xml:space="preserve">CRM</w:t>
+            </w:r>
+          </w:p>
+        </w:tc>
+        <w:tc>
+          <w:tcPr>
+            <w:tcW w:type="dxa" w:w="4680"/>
+            <w:tcBorders>
+              <w:top w:val="single" w:color="CCCCCC" w:sz="1"/>
+              <w:left w:val="single" w:color="CCCCCC" w:sz="1"/>
+              <w:bottom w:val="single" w:color="CCCCCC" w:sz="1"/>
+              <w:right w:val="single" w:color="CCCCCC" w:sz="1"/>
+            </w:tcBorders>
+            <w:shd w:fill="FFFFFF" w:val="clear"/>
+            <w:tcMar>
+              <w:top w:type="dxa" w:w="60"/>
+              <w:left w:type="dxa" w:w="100"/>
+              <w:bottom w:type="dxa" w:w="60"/>
+              <w:right w:type="dxa" w:w="100"/>
+            </w:tcMar>
+          </w:tcPr>
+          <w:p>
+            <w:r>
+              <w:rPr>
+                <w:rFonts w:ascii="Arial" w:cs="Arial" w:eastAsia="Arial" w:hAnsi="Arial"/>
+                <w:color w:val="1C1C1E"/>
+                <w:sz w:val="20"/>
+                <w:szCs w:val="20"/>
+              </w:rPr>
+              <w:t xml:space="preserve">Lightweight partner CRM built into admin — no third-party tool needed at this stage</w:t>
+            </w:r>
+          </w:p>
+        </w:tc>
+      </w:tr>
+      <w:tr>
+        <w:tc>
+          <w:tcPr>
+            <w:tcW w:type="dxa" w:w="4680"/>
+            <w:tcBorders>
+              <w:top w:val="single" w:color="CCCCCC" w:sz="1"/>
+              <w:left w:val="single" w:color="CCCCCC" w:sz="1"/>
+              <w:bottom w:val="single" w:color="CCCCCC" w:sz="1"/>
+              <w:right w:val="single" w:color="CCCCCC" w:sz="1"/>
+            </w:tcBorders>
+            <w:shd w:fill="EFF4F9" w:val="clear"/>
+            <w:tcMar>
+              <w:top w:type="dxa" w:w="60"/>
+              <w:left w:type="dxa" w:w="100"/>
+              <w:bottom w:type="dxa" w:w="60"/>
+              <w:right w:type="dxa" w:w="100"/>
+            </w:tcMar>
+          </w:tcPr>
+          <w:p>
+            <w:r>
+              <w:rPr>
+                <w:rFonts w:ascii="Arial" w:cs="Arial" w:eastAsia="Arial" w:hAnsi="Arial"/>
+                <w:b/>
+                <w:bCs/>
+                <w:color w:val="1A3557"/>
+                <w:sz w:val="20"/>
+                <w:szCs w:val="20"/>
+              </w:rPr>
+              <w:t xml:space="preserve">Admin Surface</w:t>
+            </w:r>
+          </w:p>
+        </w:tc>
+        <w:tc>
+          <w:tcPr>
+            <w:tcW w:type="dxa" w:w="4680"/>
+            <w:tcBorders>
+              <w:top w:val="single" w:color="CCCCCC" w:sz="1"/>
+              <w:left w:val="single" w:color="CCCCCC" w:sz="1"/>
+              <w:bottom w:val="single" w:color="CCCCCC" w:sz="1"/>
+              <w:right w:val="single" w:color="CCCCCC" w:sz="1"/>
+            </w:tcBorders>
+            <w:shd w:fill="FFFFFF" w:val="clear"/>
+            <w:tcMar>
+              <w:top w:type="dxa" w:w="60"/>
+              <w:left w:type="dxa" w:w="100"/>
+              <w:bottom w:type="dxa" w:w="60"/>
+              <w:right w:type="dxa" w:w="100"/>
+            </w:tcMar>
+          </w:tcPr>
+          <w:p>
+            <w:r>
+              <w:rPr>
+                <w:rFonts w:ascii="Arial" w:cs="Arial" w:eastAsia="Arial" w:hAnsi="Arial"/>
+                <w:color w:val="1C1C1E"/>
+                <w:sz w:val="20"/>
+                <w:szCs w:val="20"/>
+              </w:rPr>
+              <w:t xml:space="preserve">/admin/agents/partnerships — pipeline + search panel + outreach queue + OTA listings</w:t>
+            </w:r>
+          </w:p>
+        </w:tc>
+      </w:tr>
+      <w:tr>
+        <w:tc>
+          <w:tcPr>
+            <w:tcW w:type="dxa" w:w="4680"/>
+            <w:tcBorders>
+              <w:top w:val="single" w:color="CCCCCC" w:sz="1"/>
+              <w:left w:val="single" w:color="CCCCCC" w:sz="1"/>
+              <w:bottom w:val="single" w:color="CCCCCC" w:sz="1"/>
+              <w:right w:val="single" w:color="CCCCCC" w:sz="1"/>
+            </w:tcBorders>
+            <w:shd w:fill="EFF4F9" w:val="clear"/>
+            <w:tcMar>
+              <w:top w:type="dxa" w:w="60"/>
+              <w:left w:type="dxa" w:w="100"/>
+              <w:bottom w:type="dxa" w:w="60"/>
+              <w:right w:type="dxa" w:w="100"/>
+            </w:tcMar>
+          </w:tcPr>
+          <w:p>
+            <w:r>
+              <w:rPr>
+                <w:rFonts w:ascii="Arial" w:cs="Arial" w:eastAsia="Arial" w:hAnsi="Arial"/>
+                <w:b/>
+                <w:bCs/>
+                <w:color w:val="1A3557"/>
+                <w:sz w:val="20"/>
+                <w:szCs w:val="20"/>
+              </w:rPr>
+              <w:t xml:space="preserve">NEW in v1.1</w:t>
+            </w:r>
+          </w:p>
+        </w:tc>
+        <w:tc>
+          <w:tcPr>
+            <w:tcW w:type="dxa" w:w="4680"/>
+            <w:tcBorders>
+              <w:top w:val="single" w:color="CCCCCC" w:sz="1"/>
+              <w:left w:val="single" w:color="CCCCCC" w:sz="1"/>
+              <w:bottom w:val="single" w:color="CCCCCC" w:sz="1"/>
+              <w:right w:val="single" w:color="CCCCCC" w:sz="1"/>
+            </w:tcBorders>
+            <w:shd w:fill="FFFFFF" w:val="clear"/>
+            <w:tcMar>
+              <w:top w:type="dxa" w:w="60"/>
+              <w:left w:type="dxa" w:w="100"/>
+              <w:bottom w:type="dxa" w:w="60"/>
+              <w:right w:type="dxa" w:w="100"/>
+            </w:tcMar>
+          </w:tcPr>
+          <w:p>
+            <w:r>
+              <w:rPr>
+                <w:rFonts w:ascii="Arial" w:cs="Arial" w:eastAsia="Arial" w:hAnsi="Arial"/>
+                <w:color w:val="1C1C1E"/>
+                <w:sz w:val="20"/>
+                <w:szCs w:val="20"/>
+              </w:rPr>
+              <w:t xml:space="preserve">Partner web search with city selector, channel textarea, and auto-import to CRM</w:t>
             </w:r>
           </w:p>
         </w:tc>
@@ -16630,7 +16816,27 @@
           <w:sz w:val="22"/>
           <w:szCs w:val="22"/>
         </w:rPr>
-        <w:t xml:space="preserve">The Partnership Agent manages three outreach channels: hotel concierge relationships, corporate team outing pipeline, and OTA listing optimization. It maintains a partner CRM of target hotels, companies, and OTA profiles. Weekly it reviews the pipeline, identifies partners overdue for follow-up, and drafts personalized outreach emails. For OTAs (Viator, GetYourGuide), it generates and updates listing descriptions to match current experiences, pricing, and seasonal angles. All outreach emails require approval before sending.</w:t>
+        <w:t xml:space="preserve">The Partnership Agent manages three outreach channels: hotel concierge relationships, corporate team outing pipeline, and OTA listing optimization. It maintains a partner CRM of target hotels, companies, and OTA profiles. Weekly it reviews the pipeline, identifies partners overdue for follow-up, and drafts personalized outreach emails. For OTAs (Viator, GetYourGuide), it generates and updates listing descriptions. All outreach emails require admin approval before sending.</w:t>
+      </w:r>
+    </w:p>
+    <w:p>
+      <w:pPr>
+        <w:spacing w:after="0" w:before="20"/>
+      </w:pPr>
+    </w:p>
+    <w:p>
+      <w:pPr>
+        <w:spacing w:after="60" w:before="60"/>
+        <w:jc w:val="left"/>
+      </w:pPr>
+      <w:r>
+        <w:rPr>
+          <w:rFonts w:ascii="Arial" w:cs="Arial" w:eastAsia="Arial" w:hAnsi="Arial"/>
+          <w:color w:val="1C1C1E"/>
+          <w:sz w:val="22"/>
+          <w:szCs w:val="22"/>
+        </w:rPr>
+        <w:t xml:space="preserve">Version 1.1 adds a web search feature: from the admin panel, the admin selects a Bay Area city, specifies a channel type in a textarea (e.g., 'boutique hotels with concierge desks', 'corporate event planners', 'wine tour operators'), and initiates a search. Claude uses its web_search tool to find matching businesses, extracts their name, address, phone, website, and contact details where available, deduplicates against the existing CRM, and automatically adds new businesses as prospects. The admin reviews the import results and can edit or remove any record before it enters the active pipeline.</w:t>
       </w:r>
     </w:p>
     <w:p>
@@ -16872,7 +17078,7 @@
                 <w:sz w:val="18"/>
                 <w:szCs w:val="18"/>
               </w:rPr>
-              <w:t xml:space="preserve">Weekly outreach drafts; follow-up cadence tracking; commission agreement templates</w:t>
+              <w:t xml:space="preserve">Web search discovery + weekly outreach drafts + follow-up cadence</w:t>
             </w:r>
           </w:p>
         </w:tc>
@@ -16973,7 +17179,7 @@
                 <w:sz w:val="18"/>
                 <w:szCs w:val="18"/>
               </w:rPr>
-              <w:t xml:space="preserve">LinkedIn + email outreach; team outing proposal generator</w:t>
+              <w:t xml:space="preserve">Web search discovery + LinkedIn + email outreach + team outing proposals</w:t>
             </w:r>
           </w:p>
         </w:tc>
@@ -17175,7 +17381,7 @@
                 <w:sz w:val="18"/>
                 <w:szCs w:val="18"/>
               </w:rPr>
-              <w:t xml:space="preserve">Welcome package copy; one-off outreach campaign drafts</w:t>
+              <w:t xml:space="preserve">Web search discovery + welcome package copy + one-off outreach campaigns</w:t>
             </w:r>
           </w:p>
         </w:tc>
@@ -17354,6 +17560,309 @@
                 <w:sz w:val="18"/>
                 <w:szCs w:val="18"/>
               </w:rPr>
+              <w:t xml:space="preserve">Web search for partners by city + channel</w:t>
+            </w:r>
+          </w:p>
+        </w:tc>
+        <w:tc>
+          <w:tcPr>
+            <w:tcBorders>
+              <w:top w:val="single" w:color="CCCCCC" w:sz="1"/>
+              <w:left w:val="single" w:color="CCCCCC" w:sz="1"/>
+              <w:bottom w:val="single" w:color="CCCCCC" w:sz="1"/>
+              <w:right w:val="single" w:color="CCCCCC" w:sz="1"/>
+            </w:tcBorders>
+            <w:shd w:fill="FFFFFF" w:val="clear"/>
+            <w:tcMar>
+              <w:top w:type="dxa" w:w="60"/>
+              <w:left w:type="dxa" w:w="90"/>
+              <w:bottom w:type="dxa" w:w="60"/>
+              <w:right w:type="dxa" w:w="90"/>
+            </w:tcMar>
+          </w:tcPr>
+          <w:p>
+            <w:pPr>
+              <w:jc w:val="left"/>
+            </w:pPr>
+            <w:r>
+              <w:rPr>
+                <w:rFonts w:ascii="Arial" w:cs="Arial" w:eastAsia="Arial" w:hAnsi="Arial"/>
+                <w:b/>
+                <w:bCs/>
+                <w:color w:val="2D7A4F"/>
+                <w:sz w:val="18"/>
+                <w:szCs w:val="18"/>
+              </w:rPr>
+              <w:t xml:space="preserve">Autonomous</w:t>
+            </w:r>
+          </w:p>
+        </w:tc>
+        <w:tc>
+          <w:tcPr>
+            <w:tcBorders>
+              <w:top w:val="single" w:color="CCCCCC" w:sz="1"/>
+              <w:left w:val="single" w:color="CCCCCC" w:sz="1"/>
+              <w:bottom w:val="single" w:color="CCCCCC" w:sz="1"/>
+              <w:right w:val="single" w:color="CCCCCC" w:sz="1"/>
+            </w:tcBorders>
+            <w:shd w:fill="FFFFFF" w:val="clear"/>
+            <w:tcMar>
+              <w:top w:type="dxa" w:w="60"/>
+              <w:left w:type="dxa" w:w="90"/>
+              <w:bottom w:type="dxa" w:w="60"/>
+              <w:right w:type="dxa" w:w="90"/>
+            </w:tcMar>
+          </w:tcPr>
+          <w:p>
+            <w:pPr>
+              <w:jc w:val="left"/>
+            </w:pPr>
+            <w:r>
+              <w:rPr>
+                <w:rFonts w:ascii="Arial" w:cs="Arial" w:eastAsia="Arial" w:hAnsi="Arial"/>
+                <w:b w:val="false"/>
+                <w:bCs w:val="false"/>
+                <w:color w:val="1C1C1E"/>
+                <w:sz w:val="18"/>
+                <w:szCs w:val="18"/>
+              </w:rPr>
+              <w:t xml:space="preserve">Claude runs web_search; results extracted and deduplicated automatically</w:t>
+            </w:r>
+          </w:p>
+        </w:tc>
+      </w:tr>
+      <w:tr>
+        <w:tc>
+          <w:tcPr>
+            <w:tcBorders>
+              <w:top w:val="single" w:color="CCCCCC" w:sz="1"/>
+              <w:left w:val="single" w:color="CCCCCC" w:sz="1"/>
+              <w:bottom w:val="single" w:color="CCCCCC" w:sz="1"/>
+              <w:right w:val="single" w:color="CCCCCC" w:sz="1"/>
+            </w:tcBorders>
+            <w:shd w:fill="EFF4F9" w:val="clear"/>
+            <w:tcMar>
+              <w:top w:type="dxa" w:w="60"/>
+              <w:left w:type="dxa" w:w="90"/>
+              <w:bottom w:type="dxa" w:w="60"/>
+              <w:right w:type="dxa" w:w="90"/>
+            </w:tcMar>
+          </w:tcPr>
+          <w:p>
+            <w:pPr>
+              <w:jc w:val="left"/>
+            </w:pPr>
+            <w:r>
+              <w:rPr>
+                <w:rFonts w:ascii="Arial" w:cs="Arial" w:eastAsia="Arial" w:hAnsi="Arial"/>
+                <w:b w:val="false"/>
+                <w:bCs w:val="false"/>
+                <w:color w:val="1C1C1E"/>
+                <w:sz w:val="18"/>
+                <w:szCs w:val="18"/>
+              </w:rPr>
+              <w:t xml:space="preserve">Auto-import new businesses to CRM</w:t>
+            </w:r>
+          </w:p>
+        </w:tc>
+        <w:tc>
+          <w:tcPr>
+            <w:tcBorders>
+              <w:top w:val="single" w:color="CCCCCC" w:sz="1"/>
+              <w:left w:val="single" w:color="CCCCCC" w:sz="1"/>
+              <w:bottom w:val="single" w:color="CCCCCC" w:sz="1"/>
+              <w:right w:val="single" w:color="CCCCCC" w:sz="1"/>
+            </w:tcBorders>
+            <w:shd w:fill="EFF4F9" w:val="clear"/>
+            <w:tcMar>
+              <w:top w:type="dxa" w:w="60"/>
+              <w:left w:type="dxa" w:w="90"/>
+              <w:bottom w:type="dxa" w:w="60"/>
+              <w:right w:type="dxa" w:w="90"/>
+            </w:tcMar>
+          </w:tcPr>
+          <w:p>
+            <w:pPr>
+              <w:jc w:val="left"/>
+            </w:pPr>
+            <w:r>
+              <w:rPr>
+                <w:rFonts w:ascii="Arial" w:cs="Arial" w:eastAsia="Arial" w:hAnsi="Arial"/>
+                <w:b/>
+                <w:bCs/>
+                <w:color w:val="2D7A4F"/>
+                <w:sz w:val="18"/>
+                <w:szCs w:val="18"/>
+              </w:rPr>
+              <w:t xml:space="preserve">Autonomous</w:t>
+            </w:r>
+          </w:p>
+        </w:tc>
+        <w:tc>
+          <w:tcPr>
+            <w:tcBorders>
+              <w:top w:val="single" w:color="CCCCCC" w:sz="1"/>
+              <w:left w:val="single" w:color="CCCCCC" w:sz="1"/>
+              <w:bottom w:val="single" w:color="CCCCCC" w:sz="1"/>
+              <w:right w:val="single" w:color="CCCCCC" w:sz="1"/>
+            </w:tcBorders>
+            <w:shd w:fill="EFF4F9" w:val="clear"/>
+            <w:tcMar>
+              <w:top w:type="dxa" w:w="60"/>
+              <w:left w:type="dxa" w:w="90"/>
+              <w:bottom w:type="dxa" w:w="60"/>
+              <w:right w:type="dxa" w:w="90"/>
+            </w:tcMar>
+          </w:tcPr>
+          <w:p>
+            <w:pPr>
+              <w:jc w:val="left"/>
+            </w:pPr>
+            <w:r>
+              <w:rPr>
+                <w:rFonts w:ascii="Arial" w:cs="Arial" w:eastAsia="Arial" w:hAnsi="Arial"/>
+                <w:b w:val="false"/>
+                <w:bCs w:val="false"/>
+                <w:color w:val="1C1C1E"/>
+                <w:sz w:val="18"/>
+                <w:szCs w:val="18"/>
+              </w:rPr>
+              <w:t xml:space="preserve">Businesses not already in partners table added as status='prospect'</w:t>
+            </w:r>
+          </w:p>
+        </w:tc>
+      </w:tr>
+      <w:tr>
+        <w:tc>
+          <w:tcPr>
+            <w:tcBorders>
+              <w:top w:val="single" w:color="CCCCCC" w:sz="1"/>
+              <w:left w:val="single" w:color="CCCCCC" w:sz="1"/>
+              <w:bottom w:val="single" w:color="CCCCCC" w:sz="1"/>
+              <w:right w:val="single" w:color="CCCCCC" w:sz="1"/>
+            </w:tcBorders>
+            <w:shd w:fill="FFFFFF" w:val="clear"/>
+            <w:tcMar>
+              <w:top w:type="dxa" w:w="60"/>
+              <w:left w:type="dxa" w:w="90"/>
+              <w:bottom w:type="dxa" w:w="60"/>
+              <w:right w:type="dxa" w:w="90"/>
+            </w:tcMar>
+          </w:tcPr>
+          <w:p>
+            <w:pPr>
+              <w:jc w:val="left"/>
+            </w:pPr>
+            <w:r>
+              <w:rPr>
+                <w:rFonts w:ascii="Arial" w:cs="Arial" w:eastAsia="Arial" w:hAnsi="Arial"/>
+                <w:b w:val="false"/>
+                <w:bCs w:val="false"/>
+                <w:color w:val="1C1C1E"/>
+                <w:sz w:val="18"/>
+                <w:szCs w:val="18"/>
+              </w:rPr>
+              <w:t xml:space="preserve">Flag duplicates — business already in CRM</w:t>
+            </w:r>
+          </w:p>
+        </w:tc>
+        <w:tc>
+          <w:tcPr>
+            <w:tcBorders>
+              <w:top w:val="single" w:color="CCCCCC" w:sz="1"/>
+              <w:left w:val="single" w:color="CCCCCC" w:sz="1"/>
+              <w:bottom w:val="single" w:color="CCCCCC" w:sz="1"/>
+              <w:right w:val="single" w:color="CCCCCC" w:sz="1"/>
+            </w:tcBorders>
+            <w:shd w:fill="FFFFFF" w:val="clear"/>
+            <w:tcMar>
+              <w:top w:type="dxa" w:w="60"/>
+              <w:left w:type="dxa" w:w="90"/>
+              <w:bottom w:type="dxa" w:w="60"/>
+              <w:right w:type="dxa" w:w="90"/>
+            </w:tcMar>
+          </w:tcPr>
+          <w:p>
+            <w:pPr>
+              <w:jc w:val="left"/>
+            </w:pPr>
+            <w:r>
+              <w:rPr>
+                <w:rFonts w:ascii="Arial" w:cs="Arial" w:eastAsia="Arial" w:hAnsi="Arial"/>
+                <w:b/>
+                <w:bCs/>
+                <w:color w:val="2D7A4F"/>
+                <w:sz w:val="18"/>
+                <w:szCs w:val="18"/>
+              </w:rPr>
+              <w:t xml:space="preserve">Autonomous</w:t>
+            </w:r>
+          </w:p>
+        </w:tc>
+        <w:tc>
+          <w:tcPr>
+            <w:tcBorders>
+              <w:top w:val="single" w:color="CCCCCC" w:sz="1"/>
+              <w:left w:val="single" w:color="CCCCCC" w:sz="1"/>
+              <w:bottom w:val="single" w:color="CCCCCC" w:sz="1"/>
+              <w:right w:val="single" w:color="CCCCCC" w:sz="1"/>
+            </w:tcBorders>
+            <w:shd w:fill="FFFFFF" w:val="clear"/>
+            <w:tcMar>
+              <w:top w:type="dxa" w:w="60"/>
+              <w:left w:type="dxa" w:w="90"/>
+              <w:bottom w:type="dxa" w:w="60"/>
+              <w:right w:type="dxa" w:w="90"/>
+            </w:tcMar>
+          </w:tcPr>
+          <w:p>
+            <w:pPr>
+              <w:jc w:val="left"/>
+            </w:pPr>
+            <w:r>
+              <w:rPr>
+                <w:rFonts w:ascii="Arial" w:cs="Arial" w:eastAsia="Arial" w:hAnsi="Arial"/>
+                <w:b w:val="false"/>
+                <w:bCs w:val="false"/>
+                <w:color w:val="1C1C1E"/>
+                <w:sz w:val="18"/>
+                <w:szCs w:val="18"/>
+              </w:rPr>
+              <w:t xml:space="preserve">Matched by business_name + location_city; never creates duplicate</w:t>
+            </w:r>
+          </w:p>
+        </w:tc>
+      </w:tr>
+      <w:tr>
+        <w:tc>
+          <w:tcPr>
+            <w:tcBorders>
+              <w:top w:val="single" w:color="CCCCCC" w:sz="1"/>
+              <w:left w:val="single" w:color="CCCCCC" w:sz="1"/>
+              <w:bottom w:val="single" w:color="CCCCCC" w:sz="1"/>
+              <w:right w:val="single" w:color="CCCCCC" w:sz="1"/>
+            </w:tcBorders>
+            <w:shd w:fill="EFF4F9" w:val="clear"/>
+            <w:tcMar>
+              <w:top w:type="dxa" w:w="60"/>
+              <w:left w:type="dxa" w:w="90"/>
+              <w:bottom w:type="dxa" w:w="60"/>
+              <w:right w:type="dxa" w:w="90"/>
+            </w:tcMar>
+          </w:tcPr>
+          <w:p>
+            <w:pPr>
+              <w:jc w:val="left"/>
+            </w:pPr>
+            <w:r>
+              <w:rPr>
+                <w:rFonts w:ascii="Arial" w:cs="Arial" w:eastAsia="Arial" w:hAnsi="Arial"/>
+                <w:b w:val="false"/>
+                <w:bCs w:val="false"/>
+                <w:color w:val="1C1C1E"/>
+                <w:sz w:val="18"/>
+                <w:szCs w:val="18"/>
+              </w:rPr>
               <w:t xml:space="preserve">Draft hotel concierge outreach email</w:t>
             </w:r>
           </w:p>
@@ -17366,7 +17875,7 @@
               <w:bottom w:val="single" w:color="CCCCCC" w:sz="1"/>
               <w:right w:val="single" w:color="CCCCCC" w:sz="1"/>
             </w:tcBorders>
-            <w:shd w:fill="FFFFFF" w:val="clear"/>
+            <w:shd w:fill="EFF4F9" w:val="clear"/>
             <w:tcMar>
               <w:top w:type="dxa" w:w="60"/>
               <w:left w:type="dxa" w:w="90"/>
@@ -17399,28 +17908,28 @@
               <w:bottom w:val="single" w:color="CCCCCC" w:sz="1"/>
               <w:right w:val="single" w:color="CCCCCC" w:sz="1"/>
             </w:tcBorders>
-            <w:shd w:fill="FFFFFF" w:val="clear"/>
-            <w:tcMar>
-              <w:top w:type="dxa" w:w="60"/>
-              <w:left w:type="dxa" w:w="90"/>
-              <w:bottom w:type="dxa" w:w="60"/>
-              <w:right w:type="dxa" w:w="90"/>
-            </w:tcMar>
-          </w:tcPr>
-          <w:p>
-            <w:pPr>
-              <w:jc w:val="left"/>
-            </w:pPr>
-            <w:r>
-              <w:rPr>
-                <w:rFonts w:ascii="Arial" w:cs="Arial" w:eastAsia="Arial" w:hAnsi="Arial"/>
-                <w:b w:val="false"/>
-                <w:bCs w:val="false"/>
-                <w:color w:val="1C1C1E"/>
-                <w:sz w:val="18"/>
-                <w:szCs w:val="18"/>
-              </w:rPr>
-              <w:t xml:space="preserve">Personalized per hotel; lands in queue</w:t>
+            <w:shd w:fill="EFF4F9" w:val="clear"/>
+            <w:tcMar>
+              <w:top w:type="dxa" w:w="60"/>
+              <w:left w:type="dxa" w:w="90"/>
+              <w:bottom w:type="dxa" w:w="60"/>
+              <w:right w:type="dxa" w:w="90"/>
+            </w:tcMar>
+          </w:tcPr>
+          <w:p>
+            <w:pPr>
+              <w:jc w:val="left"/>
+            </w:pPr>
+            <w:r>
+              <w:rPr>
+                <w:rFonts w:ascii="Arial" w:cs="Arial" w:eastAsia="Arial" w:hAnsi="Arial"/>
+                <w:b w:val="false"/>
+                <w:bCs w:val="false"/>
+                <w:color w:val="1C1C1E"/>
+                <w:sz w:val="18"/>
+                <w:szCs w:val="18"/>
+              </w:rPr>
+              <w:t xml:space="preserve">Personalized per hotel; lands in admin queue</w:t>
             </w:r>
           </w:p>
         </w:tc>
@@ -17434,7 +17943,7 @@
               <w:bottom w:val="single" w:color="CCCCCC" w:sz="1"/>
               <w:right w:val="single" w:color="CCCCCC" w:sz="1"/>
             </w:tcBorders>
-            <w:shd w:fill="EFF4F9" w:val="clear"/>
+            <w:shd w:fill="FFFFFF" w:val="clear"/>
             <w:tcMar>
               <w:top w:type="dxa" w:w="60"/>
               <w:left w:type="dxa" w:w="90"/>
@@ -17467,7 +17976,7 @@
               <w:bottom w:val="single" w:color="CCCCCC" w:sz="1"/>
               <w:right w:val="single" w:color="CCCCCC" w:sz="1"/>
             </w:tcBorders>
-            <w:shd w:fill="EFF4F9" w:val="clear"/>
+            <w:shd w:fill="FFFFFF" w:val="clear"/>
             <w:tcMar>
               <w:top w:type="dxa" w:w="60"/>
               <w:left w:type="dxa" w:w="90"/>
@@ -17500,7 +18009,7 @@
               <w:bottom w:val="single" w:color="CCCCCC" w:sz="1"/>
               <w:right w:val="single" w:color="CCCCCC" w:sz="1"/>
             </w:tcBorders>
-            <w:shd w:fill="EFF4F9" w:val="clear"/>
+            <w:shd w:fill="FFFFFF" w:val="clear"/>
             <w:tcMar>
               <w:top w:type="dxa" w:w="60"/>
               <w:left w:type="dxa" w:w="90"/>
@@ -17535,7 +18044,7 @@
               <w:bottom w:val="single" w:color="CCCCCC" w:sz="1"/>
               <w:right w:val="single" w:color="CCCCCC" w:sz="1"/>
             </w:tcBorders>
-            <w:shd w:fill="FFFFFF" w:val="clear"/>
+            <w:shd w:fill="EFF4F9" w:val="clear"/>
             <w:tcMar>
               <w:top w:type="dxa" w:w="60"/>
               <w:left w:type="dxa" w:w="90"/>
@@ -17568,7 +18077,7 @@
               <w:bottom w:val="single" w:color="CCCCCC" w:sz="1"/>
               <w:right w:val="single" w:color="CCCCCC" w:sz="1"/>
             </w:tcBorders>
-            <w:shd w:fill="FFFFFF" w:val="clear"/>
+            <w:shd w:fill="EFF4F9" w:val="clear"/>
             <w:tcMar>
               <w:top w:type="dxa" w:w="60"/>
               <w:left w:type="dxa" w:w="90"/>
@@ -17601,7 +18110,7 @@
               <w:bottom w:val="single" w:color="CCCCCC" w:sz="1"/>
               <w:right w:val="single" w:color="CCCCCC" w:sz="1"/>
             </w:tcBorders>
-            <w:shd w:fill="FFFFFF" w:val="clear"/>
+            <w:shd w:fill="EFF4F9" w:val="clear"/>
             <w:tcMar>
               <w:top w:type="dxa" w:w="60"/>
               <w:left w:type="dxa" w:w="90"/>
@@ -17636,40 +18145,40 @@
               <w:bottom w:val="single" w:color="CCCCCC" w:sz="1"/>
               <w:right w:val="single" w:color="CCCCCC" w:sz="1"/>
             </w:tcBorders>
-            <w:shd w:fill="EFF4F9" w:val="clear"/>
-            <w:tcMar>
-              <w:top w:type="dxa" w:w="60"/>
-              <w:left w:type="dxa" w:w="90"/>
-              <w:bottom w:type="dxa" w:w="60"/>
-              <w:right w:type="dxa" w:w="90"/>
-            </w:tcMar>
-          </w:tcPr>
-          <w:p>
-            <w:pPr>
-              <w:jc w:val="left"/>
-            </w:pPr>
-            <w:r>
-              <w:rPr>
-                <w:rFonts w:ascii="Arial" w:cs="Arial" w:eastAsia="Arial" w:hAnsi="Arial"/>
-                <w:b w:val="false"/>
-                <w:bCs w:val="false"/>
-                <w:color w:val="1C1C1E"/>
-                <w:sz w:val="18"/>
-                <w:szCs w:val="18"/>
-              </w:rPr>
-              <w:t xml:space="preserve">Track follow-up cadence (when to re-contact)</w:t>
-            </w:r>
-          </w:p>
-        </w:tc>
-        <w:tc>
-          <w:tcPr>
-            <w:tcBorders>
-              <w:top w:val="single" w:color="CCCCCC" w:sz="1"/>
-              <w:left w:val="single" w:color="CCCCCC" w:sz="1"/>
-              <w:bottom w:val="single" w:color="CCCCCC" w:sz="1"/>
-              <w:right w:val="single" w:color="CCCCCC" w:sz="1"/>
-            </w:tcBorders>
-            <w:shd w:fill="EFF4F9" w:val="clear"/>
+            <w:shd w:fill="FFFFFF" w:val="clear"/>
+            <w:tcMar>
+              <w:top w:type="dxa" w:w="60"/>
+              <w:left w:type="dxa" w:w="90"/>
+              <w:bottom w:type="dxa" w:w="60"/>
+              <w:right w:type="dxa" w:w="90"/>
+            </w:tcMar>
+          </w:tcPr>
+          <w:p>
+            <w:pPr>
+              <w:jc w:val="left"/>
+            </w:pPr>
+            <w:r>
+              <w:rPr>
+                <w:rFonts w:ascii="Arial" w:cs="Arial" w:eastAsia="Arial" w:hAnsi="Arial"/>
+                <w:b w:val="false"/>
+                <w:bCs w:val="false"/>
+                <w:color w:val="1C1C1E"/>
+                <w:sz w:val="18"/>
+                <w:szCs w:val="18"/>
+              </w:rPr>
+              <w:t xml:space="preserve">Track follow-up cadence</w:t>
+            </w:r>
+          </w:p>
+        </w:tc>
+        <w:tc>
+          <w:tcPr>
+            <w:tcBorders>
+              <w:top w:val="single" w:color="CCCCCC" w:sz="1"/>
+              <w:left w:val="single" w:color="CCCCCC" w:sz="1"/>
+              <w:bottom w:val="single" w:color="CCCCCC" w:sz="1"/>
+              <w:right w:val="single" w:color="CCCCCC" w:sz="1"/>
+            </w:tcBorders>
+            <w:shd w:fill="FFFFFF" w:val="clear"/>
             <w:tcMar>
               <w:top w:type="dxa" w:w="60"/>
               <w:left w:type="dxa" w:w="90"/>
@@ -17702,28 +18211,28 @@
               <w:bottom w:val="single" w:color="CCCCCC" w:sz="1"/>
               <w:right w:val="single" w:color="CCCCCC" w:sz="1"/>
             </w:tcBorders>
-            <w:shd w:fill="EFF4F9" w:val="clear"/>
-            <w:tcMar>
-              <w:top w:type="dxa" w:w="60"/>
-              <w:left w:type="dxa" w:w="90"/>
-              <w:bottom w:type="dxa" w:w="60"/>
-              <w:right w:type="dxa" w:w="90"/>
-            </w:tcMar>
-          </w:tcPr>
-          <w:p>
-            <w:pPr>
-              <w:jc w:val="left"/>
-            </w:pPr>
-            <w:r>
-              <w:rPr>
-                <w:rFonts w:ascii="Arial" w:cs="Arial" w:eastAsia="Arial" w:hAnsi="Arial"/>
-                <w:b w:val="false"/>
-                <w:bCs w:val="false"/>
-                <w:color w:val="1C1C1E"/>
-                <w:sz w:val="18"/>
-                <w:szCs w:val="18"/>
-              </w:rPr>
-              <w:t xml:space="preserve">CRM status updated automatically</w:t>
+            <w:shd w:fill="FFFFFF" w:val="clear"/>
+            <w:tcMar>
+              <w:top w:type="dxa" w:w="60"/>
+              <w:left w:type="dxa" w:w="90"/>
+              <w:bottom w:type="dxa" w:w="60"/>
+              <w:right w:type="dxa" w:w="90"/>
+            </w:tcMar>
+          </w:tcPr>
+          <w:p>
+            <w:pPr>
+              <w:jc w:val="left"/>
+            </w:pPr>
+            <w:r>
+              <w:rPr>
+                <w:rFonts w:ascii="Arial" w:cs="Arial" w:eastAsia="Arial" w:hAnsi="Arial"/>
+                <w:b w:val="false"/>
+                <w:bCs w:val="false"/>
+                <w:color w:val="1C1C1E"/>
+                <w:sz w:val="18"/>
+                <w:szCs w:val="18"/>
+              </w:rPr>
+              <w:t xml:space="preserve">CRM status and next_followup_at updated automatically</w:t>
             </w:r>
           </w:p>
         </w:tc>
@@ -17737,40 +18246,40 @@
               <w:bottom w:val="single" w:color="CCCCCC" w:sz="1"/>
               <w:right w:val="single" w:color="CCCCCC" w:sz="1"/>
             </w:tcBorders>
-            <w:shd w:fill="FFFFFF" w:val="clear"/>
-            <w:tcMar>
-              <w:top w:type="dxa" w:w="60"/>
-              <w:left w:type="dxa" w:w="90"/>
-              <w:bottom w:type="dxa" w:w="60"/>
-              <w:right w:type="dxa" w:w="90"/>
-            </w:tcMar>
-          </w:tcPr>
-          <w:p>
-            <w:pPr>
-              <w:jc w:val="left"/>
-            </w:pPr>
-            <w:r>
-              <w:rPr>
-                <w:rFonts w:ascii="Arial" w:cs="Arial" w:eastAsia="Arial" w:hAnsi="Arial"/>
-                <w:b w:val="false"/>
-                <w:bCs w:val="false"/>
-                <w:color w:val="1C1C1E"/>
-                <w:sz w:val="18"/>
-                <w:szCs w:val="18"/>
-              </w:rPr>
-              <w:t xml:space="preserve">Flag partners overdue for follow-up (30 days)</w:t>
-            </w:r>
-          </w:p>
-        </w:tc>
-        <w:tc>
-          <w:tcPr>
-            <w:tcBorders>
-              <w:top w:val="single" w:color="CCCCCC" w:sz="1"/>
-              <w:left w:val="single" w:color="CCCCCC" w:sz="1"/>
-              <w:bottom w:val="single" w:color="CCCCCC" w:sz="1"/>
-              <w:right w:val="single" w:color="CCCCCC" w:sz="1"/>
-            </w:tcBorders>
-            <w:shd w:fill="FFFFFF" w:val="clear"/>
+            <w:shd w:fill="EFF4F9" w:val="clear"/>
+            <w:tcMar>
+              <w:top w:type="dxa" w:w="60"/>
+              <w:left w:type="dxa" w:w="90"/>
+              <w:bottom w:type="dxa" w:w="60"/>
+              <w:right w:type="dxa" w:w="90"/>
+            </w:tcMar>
+          </w:tcPr>
+          <w:p>
+            <w:pPr>
+              <w:jc w:val="left"/>
+            </w:pPr>
+            <w:r>
+              <w:rPr>
+                <w:rFonts w:ascii="Arial" w:cs="Arial" w:eastAsia="Arial" w:hAnsi="Arial"/>
+                <w:b w:val="false"/>
+                <w:bCs w:val="false"/>
+                <w:color w:val="1C1C1E"/>
+                <w:sz w:val="18"/>
+                <w:szCs w:val="18"/>
+              </w:rPr>
+              <w:t xml:space="preserve">Flag partners overdue 30 days</w:t>
+            </w:r>
+          </w:p>
+        </w:tc>
+        <w:tc>
+          <w:tcPr>
+            <w:tcBorders>
+              <w:top w:val="single" w:color="CCCCCC" w:sz="1"/>
+              <w:left w:val="single" w:color="CCCCCC" w:sz="1"/>
+              <w:bottom w:val="single" w:color="CCCCCC" w:sz="1"/>
+              <w:right w:val="single" w:color="CCCCCC" w:sz="1"/>
+            </w:tcBorders>
+            <w:shd w:fill="EFF4F9" w:val="clear"/>
             <w:tcMar>
               <w:top w:type="dxa" w:w="60"/>
               <w:left w:type="dxa" w:w="90"/>
@@ -17803,28 +18312,28 @@
               <w:bottom w:val="single" w:color="CCCCCC" w:sz="1"/>
               <w:right w:val="single" w:color="CCCCCC" w:sz="1"/>
             </w:tcBorders>
-            <w:shd w:fill="FFFFFF" w:val="clear"/>
-            <w:tcMar>
-              <w:top w:type="dxa" w:w="60"/>
-              <w:left w:type="dxa" w:w="90"/>
-              <w:bottom w:type="dxa" w:w="60"/>
-              <w:right w:type="dxa" w:w="90"/>
-            </w:tcMar>
-          </w:tcPr>
-          <w:p>
-            <w:pPr>
-              <w:jc w:val="left"/>
-            </w:pPr>
-            <w:r>
-              <w:rPr>
-                <w:rFonts w:ascii="Arial" w:cs="Arial" w:eastAsia="Arial" w:hAnsi="Arial"/>
-                <w:b w:val="false"/>
-                <w:bCs w:val="false"/>
-                <w:color w:val="1C1C1E"/>
-                <w:sz w:val="18"/>
-                <w:szCs w:val="18"/>
-              </w:rPr>
-              <w:t xml:space="preserve">Alert in admin dashboard</w:t>
+            <w:shd w:fill="EFF4F9" w:val="clear"/>
+            <w:tcMar>
+              <w:top w:type="dxa" w:w="60"/>
+              <w:left w:type="dxa" w:w="90"/>
+              <w:bottom w:type="dxa" w:w="60"/>
+              <w:right w:type="dxa" w:w="90"/>
+            </w:tcMar>
+          </w:tcPr>
+          <w:p>
+            <w:pPr>
+              <w:jc w:val="left"/>
+            </w:pPr>
+            <w:r>
+              <w:rPr>
+                <w:rFonts w:ascii="Arial" w:cs="Arial" w:eastAsia="Arial" w:hAnsi="Arial"/>
+                <w:b w:val="false"/>
+                <w:bCs w:val="false"/>
+                <w:color w:val="1C1C1E"/>
+                <w:sz w:val="18"/>
+                <w:szCs w:val="18"/>
+              </w:rPr>
+              <w:t xml:space="preserve">Alert badge in admin dashboard</w:t>
             </w:r>
           </w:p>
         </w:tc>
@@ -17838,40 +18347,40 @@
               <w:bottom w:val="single" w:color="CCCCCC" w:sz="1"/>
               <w:right w:val="single" w:color="CCCCCC" w:sz="1"/>
             </w:tcBorders>
-            <w:shd w:fill="EFF4F9" w:val="clear"/>
-            <w:tcMar>
-              <w:top w:type="dxa" w:w="60"/>
-              <w:left w:type="dxa" w:w="90"/>
-              <w:bottom w:type="dxa" w:w="60"/>
-              <w:right w:type="dxa" w:w="90"/>
-            </w:tcMar>
-          </w:tcPr>
-          <w:p>
-            <w:pPr>
-              <w:jc w:val="left"/>
-            </w:pPr>
-            <w:r>
-              <w:rPr>
-                <w:rFonts w:ascii="Arial" w:cs="Arial" w:eastAsia="Arial" w:hAnsi="Arial"/>
-                <w:b w:val="false"/>
-                <w:bCs w:val="false"/>
-                <w:color w:val="1C1C1E"/>
-                <w:sz w:val="18"/>
-                <w:szCs w:val="18"/>
-              </w:rPr>
-              <w:t xml:space="preserve">Log email opens and replies (if connected)</w:t>
-            </w:r>
-          </w:p>
-        </w:tc>
-        <w:tc>
-          <w:tcPr>
-            <w:tcBorders>
-              <w:top w:val="single" w:color="CCCCCC" w:sz="1"/>
-              <w:left w:val="single" w:color="CCCCCC" w:sz="1"/>
-              <w:bottom w:val="single" w:color="CCCCCC" w:sz="1"/>
-              <w:right w:val="single" w:color="CCCCCC" w:sz="1"/>
-            </w:tcBorders>
-            <w:shd w:fill="EFF4F9" w:val="clear"/>
+            <w:shd w:fill="FFFFFF" w:val="clear"/>
+            <w:tcMar>
+              <w:top w:type="dxa" w:w="60"/>
+              <w:left w:type="dxa" w:w="90"/>
+              <w:bottom w:type="dxa" w:w="60"/>
+              <w:right w:type="dxa" w:w="90"/>
+            </w:tcMar>
+          </w:tcPr>
+          <w:p>
+            <w:pPr>
+              <w:jc w:val="left"/>
+            </w:pPr>
+            <w:r>
+              <w:rPr>
+                <w:rFonts w:ascii="Arial" w:cs="Arial" w:eastAsia="Arial" w:hAnsi="Arial"/>
+                <w:b w:val="false"/>
+                <w:bCs w:val="false"/>
+                <w:color w:val="1C1C1E"/>
+                <w:sz w:val="18"/>
+                <w:szCs w:val="18"/>
+              </w:rPr>
+              <w:t xml:space="preserve">Log email opens and replies</w:t>
+            </w:r>
+          </w:p>
+        </w:tc>
+        <w:tc>
+          <w:tcPr>
+            <w:tcBorders>
+              <w:top w:val="single" w:color="CCCCCC" w:sz="1"/>
+              <w:left w:val="single" w:color="CCCCCC" w:sz="1"/>
+              <w:bottom w:val="single" w:color="CCCCCC" w:sz="1"/>
+              <w:right w:val="single" w:color="CCCCCC" w:sz="1"/>
+            </w:tcBorders>
+            <w:shd w:fill="FFFFFF" w:val="clear"/>
             <w:tcMar>
               <w:top w:type="dxa" w:w="60"/>
               <w:left w:type="dxa" w:w="90"/>
@@ -17904,7 +18413,7 @@
               <w:bottom w:val="single" w:color="CCCCCC" w:sz="1"/>
               <w:right w:val="single" w:color="CCCCCC" w:sz="1"/>
             </w:tcBorders>
-            <w:shd w:fill="EFF4F9" w:val="clear"/>
+            <w:shd w:fill="FFFFFF" w:val="clear"/>
             <w:tcMar>
               <w:top w:type="dxa" w:w="60"/>
               <w:left w:type="dxa" w:w="90"/>
@@ -17939,7 +18448,7 @@
               <w:bottom w:val="single" w:color="CCCCCC" w:sz="1"/>
               <w:right w:val="single" w:color="CCCCCC" w:sz="1"/>
             </w:tcBorders>
-            <w:shd w:fill="FFFFFF" w:val="clear"/>
+            <w:shd w:fill="EFF4F9" w:val="clear"/>
             <w:tcMar>
               <w:top w:type="dxa" w:w="60"/>
               <w:left w:type="dxa" w:w="90"/>
@@ -17972,7 +18481,7 @@
               <w:bottom w:val="single" w:color="CCCCCC" w:sz="1"/>
               <w:right w:val="single" w:color="CCCCCC" w:sz="1"/>
             </w:tcBorders>
-            <w:shd w:fill="FFFFFF" w:val="clear"/>
+            <w:shd w:fill="EFF4F9" w:val="clear"/>
             <w:tcMar>
               <w:top w:type="dxa" w:w="60"/>
               <w:left w:type="dxa" w:w="90"/>
@@ -18005,28 +18514,28 @@
               <w:bottom w:val="single" w:color="CCCCCC" w:sz="1"/>
               <w:right w:val="single" w:color="CCCCCC" w:sz="1"/>
             </w:tcBorders>
-            <w:shd w:fill="FFFFFF" w:val="clear"/>
-            <w:tcMar>
-              <w:top w:type="dxa" w:w="60"/>
-              <w:left w:type="dxa" w:w="90"/>
-              <w:bottom w:type="dxa" w:w="60"/>
-              <w:right w:type="dxa" w:w="90"/>
-            </w:tcMar>
-          </w:tcPr>
-          <w:p>
-            <w:pPr>
-              <w:jc w:val="left"/>
-            </w:pPr>
-            <w:r>
-              <w:rPr>
-                <w:rFonts w:ascii="Arial" w:cs="Arial" w:eastAsia="Arial" w:hAnsi="Arial"/>
-                <w:b w:val="false"/>
-                <w:bCs w:val="false"/>
-                <w:color w:val="1C1C1E"/>
-                <w:sz w:val="18"/>
-                <w:szCs w:val="18"/>
-              </w:rPr>
-              <w:t xml:space="preserve">Summary email to admin every Monday</w:t>
+            <w:shd w:fill="EFF4F9" w:val="clear"/>
+            <w:tcMar>
+              <w:top w:type="dxa" w:w="60"/>
+              <w:left w:type="dxa" w:w="90"/>
+              <w:bottom w:type="dxa" w:w="60"/>
+              <w:right w:type="dxa" w:w="90"/>
+            </w:tcMar>
+          </w:tcPr>
+          <w:p>
+            <w:pPr>
+              <w:jc w:val="left"/>
+            </w:pPr>
+            <w:r>
+              <w:rPr>
+                <w:rFonts w:ascii="Arial" w:cs="Arial" w:eastAsia="Arial" w:hAnsi="Arial"/>
+                <w:b w:val="false"/>
+                <w:bCs w:val="false"/>
+                <w:color w:val="1C1C1E"/>
+                <w:sz w:val="18"/>
+                <w:szCs w:val="18"/>
+              </w:rPr>
+              <w:t xml:space="preserve">Email to admin every Monday 9 AM</w:t>
             </w:r>
           </w:p>
         </w:tc>
@@ -18051,7 +18560,589 @@
           <w:sz w:val="28"/>
           <w:szCs w:val="28"/>
         </w:rPr>
-        <w:t xml:space="preserve">4.4 New DB Tables — Partner CRM</w:t>
+        <w:t xml:space="preserve">4.4 Partner Discovery — Web Search UI</w:t>
+      </w:r>
+    </w:p>
+    <w:p>
+      <w:pPr>
+        <w:spacing w:after="60" w:before="60"/>
+        <w:jc w:val="left"/>
+      </w:pPr>
+      <w:r>
+        <w:rPr>
+          <w:rFonts w:ascii="Arial" w:cs="Arial" w:eastAsia="Arial" w:hAnsi="Arial"/>
+          <w:color w:val="1C1C1E"/>
+          <w:sz w:val="22"/>
+          <w:szCs w:val="22"/>
+        </w:rPr>
+        <w:t xml:space="preserve">A dedicated search panel accessible from /admin/agents/partnerships/search. The admin fills in three fields and clicks Search. Claude performs the web search, processes results, and returns a list of discovered businesses for review before import.</w:t>
+      </w:r>
+    </w:p>
+    <w:p>
+      <w:pPr>
+        <w:spacing w:after="0" w:before="40"/>
+      </w:pPr>
+    </w:p>
+    <w:p>
+      <w:pPr>
+        <w:spacing w:after="60" w:before="60"/>
+      </w:pPr>
+      <w:r>
+        <w:rPr>
+          <w:rFonts w:ascii="Courier New" w:cs="Courier New" w:eastAsia="Courier New" w:hAnsi="Courier New"/>
+          <w:color w:val="1A3557"/>
+          <w:sz w:val="17"/>
+          <w:szCs w:val="17"/>
+        </w:rPr>
+        <w:t xml:space="preserve">{# templates/admin/partnerships/search.html #}
+&lt;div class='card border-0'
+     style='border:0.5px solid #D0D8E0!important;border-radius:14px;'&gt;
+  &lt;div class='card-body' style='padding:24px;'&gt;
+    &lt;div style='font-size:11px;font-weight:500;letter-spacing:.06em;
+         color:#5A6A7A;margin-bottom:16px;'&gt;
+      DISCOVER NEW PARTNERS
+    &lt;/div&gt;
+    &lt;form method='POST' action='{{ url_for("admin.partner_search") }}'
+          id='partnerSearchForm'&gt;
+      {{ form.hidden_tag() }}
+      {# City selector #}
+      &lt;div class='row g-3 mb-3'&gt;
+        &lt;div class='col-md-4'&gt;
+          &lt;label style='font-size:13px;font-weight:500;color:#1C1C1E;
+                 display:block;margin-bottom:6px;'&gt;
+            Bay Area City
+          &lt;/label&gt;
+          &lt;select name='search_city' class='form-select'
+                  style='border-color:#D0D8E0;border-radius:10px;font-size:14px;'&gt;
+            &lt;option value=''&gt;— Select a city —&lt;/option&gt;
+            {% for city in bay_area_cities %}
+            &lt;option value='{{ city }}'&gt;{{ city }}&lt;/option&gt;
+            {% endfor %}
+          &lt;/select&gt;
+        &lt;/div&gt;
+        {# Partner type selector #}
+        &lt;div class='col-md-4'&gt;
+          &lt;label style='font-size:13px;font-weight:500;color:#1C1C1E;
+                 display:block;margin-bottom:6px;'&gt;
+            Partner Type
+          &lt;/label&gt;
+          &lt;select name='partner_type' class='form-select'
+                  style='border-color:#D0D8E0;border-radius:10px;font-size:14px;'&gt;
+            &lt;option value='hotel'&gt;Hotel Concierge&lt;/option&gt;
+            &lt;option value='corporate'&gt;Corporate / HR&lt;/option&gt;
+            &lt;option value='ota'&gt;OTA / Tour Platform&lt;/option&gt;
+            &lt;option value='relocation'&gt;Relocation Firm&lt;/option&gt;
+          &lt;/select&gt;
+        &lt;/div&gt;
+        {# Max results #}
+        &lt;div class='col-md-4'&gt;
+          &lt;label style='font-size:13px;font-weight:500;color:#1C1C1E;
+                 display:block;margin-bottom:6px;'&gt;
+            Max Results
+          &lt;/label&gt;
+          &lt;select name='max_results' class='form-select'
+                  style='border-color:#D0D8E0;border-radius:10px;font-size:14px;'&gt;
+            &lt;option value='10'&gt;10&lt;/option&gt;
+            &lt;option value='20' selected&gt;20&lt;/option&gt;
+            &lt;option value='30'&gt;30&lt;/option&gt;
+            &lt;option value='50'&gt;50&lt;/option&gt;
+          &lt;/select&gt;
+        &lt;/div&gt;
+      &lt;/div&gt;
+      {# Channel textarea — the key field #}
+      &lt;div class='mb-3'&gt;
+        &lt;label style='font-size:13px;font-weight:500;color:#1C1C1E;
+               display:block;margin-bottom:4px;'&gt;
+          Channel Description
+          &lt;span style='font-weight:400;color:#5A6A7A;'&gt;
+            — describe exactly what kind of business to find
+          &lt;/span&gt;
+        &lt;/label&gt;
+        &lt;textarea name='channel_description'
+                  rows='3'
+                  maxlength='500'
+                  placeholder='Examples:
+  Boutique hotels with a concierge desk that recommend local tours to guests
+  Tech companies with 50-200 employees that organize team offsites and events
+  Corporate event planning companies that serve Silicon Valley clients
+  Wine tour operators and tasting room concierges in Sonoma County'
+                  class='form-control'
+                  style='border-color:#D0D8E0;border-radius:10px;
+                         font-size:13px;resize:vertical;'
+                  required&gt;{{ request.form.get('channel_description','') }}&lt;/textarea&gt;
+        &lt;div style='font-size:11px;color:#5A6A7A;margin-top:4px;'&gt;
+          Be specific. The more detail you provide, the more targeted the results.
+        &lt;/div&gt;
+      &lt;/div&gt;
+      &lt;button type='submit'
+              style='background:#2E7D8C;color:#fff;border:none;
+                     padding:10px 24px;border-radius:9999px;
+                     font-size:14px;font-weight:500;cursor:pointer;'&gt;
+        &amp;#128269; Search for Partners
+      &lt;/button&gt;
+      &lt;span style='font-size:12px;color:#5A6A7A;margin-left:12px;'&gt;
+        Claude will search the web and return a list of matching businesses.
+      &lt;/span&gt;
+    &lt;/form&gt;
+  &lt;/div&gt;
+&lt;/div&gt;</w:t>
+      </w:r>
+    </w:p>
+    <w:p>
+      <w:pPr>
+        <w:spacing w:after="0" w:before="60"/>
+      </w:pPr>
+    </w:p>
+    <w:p>
+      <w:pPr>
+        <w:pStyle w:val="Heading2"/>
+        <w:spacing w:after="120" w:before="280"/>
+      </w:pPr>
+      <w:r>
+        <w:rPr>
+          <w:rFonts w:ascii="Arial" w:cs="Arial" w:eastAsia="Arial" w:hAnsi="Arial"/>
+          <w:b/>
+          <w:bCs/>
+          <w:color w:val="2E7D8C"/>
+          <w:sz w:val="28"/>
+          <w:szCs w:val="28"/>
+        </w:rPr>
+        <w:t xml:space="preserve">4.5 Partner Discovery — Flask Route</w:t>
+      </w:r>
+    </w:p>
+    <w:p>
+      <w:pPr>
+        <w:spacing w:after="60" w:before="60"/>
+      </w:pPr>
+      <w:r>
+        <w:rPr>
+          <w:rFonts w:ascii="Courier New" w:cs="Courier New" w:eastAsia="Courier New" w:hAnsi="Courier New"/>
+          <w:color w:val="1A3557"/>
+          <w:sz w:val="17"/>
+          <w:szCs w:val="17"/>
+        </w:rPr>
+        <w:t xml:space="preserve"># app/blueprints/admin/partnerships.py
+from flask import Blueprint, render_template, request, redirect, url_for, flash
+from app.agents.partner.search import run_partner_search
+from app.models import Partner
+from app.weather.cities import SERVING_CITIES
+bp = Blueprint('admin_partnerships', __name__)
+BAY_AREA_CITIES = [c['name'] + ' CA' for c in SERVING_CITIES] + [
+    'Oakland CA', 'Berkeley CA', 'Walnut Creek CA', 'San Rafael CA',
+    'Sonoma CA', 'Napa CA', 'Half Moon Bay CA',
+]
+@bp.route('/admin/agents/partnerships/search', methods=['GET','POST'])
+@admin_required
+def partner_search():
+    results      = None
+    imported     = 0
+    duplicates   = 0
+    search_meta  = {}
+    if request.method == 'POST':
+        city         = request.form.get('search_city', '').strip()
+        partner_type = request.form.get('partner_type', 'hotel')
+        channel_desc = request.form.get('channel_description', '').strip()
+        max_results  = int(request.form.get('max_results', 20))
+        if not city or not channel_desc:
+            flash('City and channel description are required.', 'warning')
+        else:
+            search_meta = {
+                'city': city, 'partner_type': partner_type,
+                'channel_description': channel_desc,
+            }
+            results, imported, duplicates = run_partner_search(
+                city=city,
+                partner_type=partner_type,
+                channel_description=channel_desc,
+                max_results=max_results,
+            )
+    return render_template(
+        'admin/partnerships/search.html',
+        bay_area_cities = BAY_AREA_CITIES,
+        results         = results,
+        imported        = imported,
+        duplicates      = duplicates,
+        search_meta     = search_meta,
+    )</w:t>
+      </w:r>
+    </w:p>
+    <w:p>
+      <w:pPr>
+        <w:spacing w:after="0" w:before="60"/>
+      </w:pPr>
+    </w:p>
+    <w:p>
+      <w:pPr>
+        <w:pStyle w:val="Heading2"/>
+        <w:spacing w:after="120" w:before="280"/>
+      </w:pPr>
+      <w:r>
+        <w:rPr>
+          <w:rFonts w:ascii="Arial" w:cs="Arial" w:eastAsia="Arial" w:hAnsi="Arial"/>
+          <w:b/>
+          <w:bCs/>
+          <w:color w:val="2E7D8C"/>
+          <w:sz w:val="28"/>
+          <w:szCs w:val="28"/>
+        </w:rPr>
+        <w:t xml:space="preserve">4.6 Partner Discovery — Claude Web Search Agent</w:t>
+      </w:r>
+    </w:p>
+    <w:p>
+      <w:pPr>
+        <w:spacing w:after="60" w:before="60"/>
+      </w:pPr>
+      <w:r>
+        <w:rPr>
+          <w:rFonts w:ascii="Courier New" w:cs="Courier New" w:eastAsia="Courier New" w:hAnsi="Courier New"/>
+          <w:color w:val="1A3557"/>
+          <w:sz w:val="17"/>
+          <w:szCs w:val="17"/>
+        </w:rPr>
+        <w:t xml:space="preserve"># app/agents/partner/search.py
+import anthropic, json, os, re
+from app.models import Partner
+from app.extensions import db
+from app.utils import generate_pk
+from datetime import datetime, timezone
+client = anthropic.Anthropic(api_key=os.environ['ANTHROPIC_API_KEY'])
+SEARCH_SYSTEM = """
+You are a business research agent for Bay Area Experiences,
+a private tour company in the San Francisco Bay Area.
+Your job is to search the web for potential business partners
+that match the admin's channel description.
+For each business found, extract:
+- business_name: official business name
+- address: street address if available
+- city: city name
+- phone: phone number if available
+- website: URL if available
+- contact_name: specific contact person name if found
+- contact_email: email address if found
+- contact_title: job title if found (e.g., 'Concierge Manager')
+- why_good_fit: 1 sentence on why this is a good BAE partner
+RULES:
+- Only include real, currently operating businesses.
+- Do not include large chains (Hilton, Marriott, Sheraton, etc.).
+- Prioritize businesses with a named contact or concierge desk.
+- Output ONLY valid JSON — an array of business objects.
+- If you cannot find enough results, return what you have.
+"""
+def run_partner_search(
+    city: str,
+    partner_type: str,
+    channel_description: str,
+    max_results: int = 20,
+) -&gt; tuple[list, int, int]:
+    """
+    Use Claude with web_search tool to find potential partners.
+    Returns: (results_list, imported_count, duplicate_count)
+    """
+    user_prompt = f"""
+Search the web for potential Bay Area Experiences partners.
+CITY: {city}
+PARTNER TYPE: {partner_type}
+CHANNEL DESCRIPTION: {channel_description}
+MAX RESULTS: {max_results}
+Search for businesses matching this description in {city}.
+Use multiple searches to find a comprehensive list.
+For hotels: search for boutique hotels, bed and breakfasts,
+  and independent hotels with concierge services.
+For corporate: search LinkedIn, company websites, and
+  business directories for HR contacts at matching companies.
+For OTAs: search tour booking platforms and local operators.
+Return a JSON array of up to {max_results} businesses:
+[
+  {{
+    "business_name": "...",
+    "address": "...",
+    "city": "{city}",
+    "phone": "...",
+    "website": "...",
+    "contact_name": "...",
+    "contact_email": "...",
+    "contact_title": "...",
+    "why_good_fit": "..."
+  }}
+]
+"""
+    # Call Claude with web_search tool enabled
+    response = client.messages.create(
+        model      = 'claude-sonnet-4-6',
+        max_tokens = 4096,
+        system     = SEARCH_SYSTEM,
+        tools      = [{'type': 'web_search_20250305', 'name': 'web_search'}],
+        messages   = [{'role': 'user', 'content': user_prompt}],
+    )
+    # Extract text from response content blocks
+    raw_text = ''
+    for block in response.content:
+        if block.type == 'text':
+            raw_text += block.text
+    # Parse JSON array from response
+    try:
+        # Strip markdown code fences if present
+        clean = re.sub(r'```(?:json)?', '', raw_text).strip()
+        # Find the JSON array
+        start = clean.find('[')
+        end   = clean.rfind(']') + 1
+        businesses = json.loads(clean[start:end]) if start &gt;= 0 else []
+    except Exception:
+        businesses = []
+    return _import_to_crm(businesses, partner_type)
+def _import_to_crm(
+    businesses: list,
+    partner_type: str,
+) -&gt; tuple[list, int, int]:
+    """
+    For each discovered business:
+    - Check if it already exists in the partners table
+    - If not: create a new prospect record
+    - If yes: mark as duplicate (skip)
+    Returns: (enriched_results, imported_count, duplicate_count)
+    """
+    imported   = 0
+    duplicates = 0
+    results    = []
+    now        = datetime.now(timezone.utc)
+    for biz in businesses:
+        name = (biz.get('business_name') or '').strip()
+        city = (biz.get('city') or '').strip()
+        if not name:
+            continue
+        # Deduplicate: match on normalised business name + city
+        existing = Partner.query.filter(
+            db.func.lower(Partner.business_name) == name.lower(),
+            db.func.lower(Partner.location_city)  == city.lower(),
+        ).first()
+        if existing:
+            biz['_status']     = 'duplicate'
+            biz['_partner_id'] = existing.partner_id
+            duplicates += 1
+        else:
+            partner = Partner(
+                partner_id    = generate_pk(),
+                partner_type  = partner_type,
+                business_name = name,
+                contact_name  = biz.get('contact_name') or None,
+                contact_email = biz.get('contact_email') or None,
+                contact_phone = biz.get('phone') or None,
+                location_city = city,
+                status        = 'prospect',
+                notes         = biz.get('why_good_fit') or None,
+                created_at    = now,
+            )
+            db.session.add(partner)
+            biz['_status']     = 'imported'
+            biz['_partner_id'] = partner.partner_id
+            imported += 1
+        # Store additional fields not in core schema for display
+        biz['_address'] = biz.get('address', '')
+        biz['_website'] = biz.get('website', '')
+        biz['_contact_title'] = biz.get('contact_title', '')
+        results.append(biz)
+    db.session.commit()
+    return results, imported, duplicates</w:t>
+      </w:r>
+    </w:p>
+    <w:p>
+      <w:pPr>
+        <w:spacing w:after="0" w:before="60"/>
+      </w:pPr>
+    </w:p>
+    <w:p>
+      <w:pPr>
+        <w:pStyle w:val="Heading2"/>
+        <w:spacing w:after="120" w:before="280"/>
+      </w:pPr>
+      <w:r>
+        <w:rPr>
+          <w:rFonts w:ascii="Arial" w:cs="Arial" w:eastAsia="Arial" w:hAnsi="Arial"/>
+          <w:b/>
+          <w:bCs/>
+          <w:color w:val="2E7D8C"/>
+          <w:sz w:val="28"/>
+          <w:szCs w:val="28"/>
+        </w:rPr>
+        <w:t xml:space="preserve">4.7 Search Results Display</w:t>
+      </w:r>
+    </w:p>
+    <w:p>
+      <w:pPr>
+        <w:spacing w:after="60" w:before="60"/>
+        <w:jc w:val="left"/>
+      </w:pPr>
+      <w:r>
+        <w:rPr>
+          <w:rFonts w:ascii="Arial" w:cs="Arial" w:eastAsia="Arial" w:hAnsi="Arial"/>
+          <w:color w:val="1C1C1E"/>
+          <w:sz w:val="22"/>
+          <w:szCs w:val="22"/>
+        </w:rPr>
+        <w:t xml:space="preserve">After the search completes, the results render inline on the same page below the search form. Each discovered business is shown as a card with its data, import status (green 'Added to CRM' or amber 'Already exists'), and a link to the CRM record. The admin can remove any imported record with one click before it enters the active pipeline.</w:t>
+      </w:r>
+    </w:p>
+    <w:p>
+      <w:pPr>
+        <w:spacing w:after="60" w:before="60"/>
+      </w:pPr>
+      <w:r>
+        <w:rPr>
+          <w:rFonts w:ascii="Courier New" w:cs="Courier New" w:eastAsia="Courier New" w:hAnsi="Courier New"/>
+          <w:color w:val="1A3557"/>
+          <w:sz w:val="17"/>
+          <w:szCs w:val="17"/>
+        </w:rPr>
+        <w:t xml:space="preserve">{# templates/admin/partnerships/search.html — results section #}
+{% if results is not none %}
+&lt;div class='mt-4'&gt;
+  {# Summary bar #}
+  &lt;div style='display:flex;gap:16px;align-items:center;
+       margin-bottom:16px;flex-wrap:wrap;'&gt;
+    &lt;div style='font-size:15px;font-weight:500;color:#1A3557;'&gt;
+      {{ results|length }} business(es) found
+    &lt;/div&gt;
+    &lt;span style='background:#EAF4EE;color:#1A5230;font-size:12px;
+           font-weight:500;padding:3px 12px;border-radius:9999px;'&gt;
+      &amp;#10003; {{ imported }} added to CRM
+    &lt;/span&gt;
+    {% if duplicates &gt; 0 %}
+    &lt;span style='background:#FDF6EC;color:#8B6419;font-size:12px;
+           font-weight:500;padding:3px 12px;border-radius:9999px;'&gt;
+      {{ duplicates }} already in CRM
+    &lt;/span&gt;
+    {% endif %}
+    &lt;span style='font-size:12px;color:#5A6A7A;'&gt;
+      Search: {{ search_meta.city }} ·
+      {{ search_meta.partner_type|title }} ·
+      "{{ search_meta.channel_description[:60] }}..."
+    &lt;/span&gt;
+  &lt;/div&gt;
+  {# Result cards #}
+  &lt;div style='display:flex;flex-direction:column;gap:10px;'&gt;
+    {% for biz in results %}
+    &lt;div style='background:#fff;border:0.5px solid #D0D8E0;
+         border-radius:12px;padding:14px 16px;
+         display:flex;justify-content:space-between;
+         align-items:flex-start;gap:12px;'&gt;
+      &lt;div style='flex:1;'&gt;
+        &lt;div style='font-size:14px;font-weight:500;color:#1A3557;
+             margin-bottom:3px;'&gt;
+          {{ biz.business_name }}
+        &lt;/div&gt;
+        &lt;div style='font-size:12px;color:#5A6A7A;margin-bottom:4px;'&gt;
+          {% if biz._address %}{{ biz._address }} · {% endif %}
+          {{ biz.city }}
+          {% if biz.phone %} · {{ biz.phone }}{% endif %}
+          {% if biz._website %}
+          · &lt;a href='{{ biz._website }}' target='_blank'
+               style='color:#2E7D8C;'&gt;{{ biz._website[:40] }}&lt;/a&gt;
+          {% endif %}
+        &lt;/div&gt;
+        {% if biz.contact_name %}
+        &lt;div style='font-size:12px;color:#1C1C1E;'&gt;
+          &amp;#128100; {{ biz.contact_name }}
+          {% if biz._contact_title %} — {{ biz._contact_title }}{% endif %}
+          {% if biz.contact_email %}
+          · &lt;a href='mailto:{{ biz.contact_email }}'
+               style='color:#2E7D8C;'&gt;{{ biz.contact_email }}&lt;/a&gt;
+          {% endif %}
+        &lt;/div&gt;
+        {% endif %}
+        {% if biz.why_good_fit %}
+        &lt;div style='font-size:11px;color:#5A6A7A;margin-top:5px;
+             font-style:italic;'&gt;
+          {{ biz.why_good_fit }}
+        &lt;/div&gt;
+        {% endif %}
+      &lt;/div&gt;
+      &lt;div style='display:flex;flex-direction:column;
+           align-items:flex-end;gap:6px;flex-shrink:0;'&gt;
+        {% if biz._status == 'imported' %}
+        &lt;span style='background:#EAF4EE;color:#1A5230;font-size:11px;
+               font-weight:500;padding:3px 10px;border-radius:9999px;
+               white-space:nowrap;'&gt;
+          &amp;#10003; Added to CRM
+        &lt;/span&gt;
+        &lt;a href='{{ url_for("admin_partnerships.edit",
+                    partner_id=biz._partner_id) }}'
+           style='font-size:11px;color:#2E7D8C;text-decoration:none;'&gt;
+          Edit record &amp;rarr;
+        &lt;/a&gt;
+        &lt;form method='POST'
+              action='{{ url_for("admin_partnerships.delete",
+                         partner_id=biz._partner_id) }}'
+              style='margin:0;'&gt;
+          {{ csrf_token_field() }}
+          &lt;button type='submit'
+                  onclick='return confirm("Remove this partner?")'
+                  style='font-size:11px;color:#B03A2E;background:none;
+                         border:none;cursor:pointer;padding:0;'&gt;
+            Remove
+          &lt;/button&gt;
+        &lt;/form&gt;
+        {% else %}
+        &lt;span style='background:#FDF6EC;color:#8B6419;font-size:11px;
+               font-weight:500;padding:3px 10px;border-radius:9999px;
+               white-space:nowrap;'&gt;
+          Already in CRM
+        &lt;/span&gt;
+        &lt;a href='{{ url_for("admin_partnerships.edit",
+                    partner_id=biz._partner_id) }}'
+           style='font-size:11px;color:#2E7D8C;text-decoration:none;'&gt;
+          View record &amp;rarr;
+        &lt;/a&gt;
+        {% endif %}
+      &lt;/div&gt;
+    &lt;/div&gt;
+    {% endfor %}
+  &lt;/div&gt;
+  {% if results|length == 0 %}
+  &lt;div style='background:#F2F5F8;border-radius:10px;padding:20px;
+       text-align:center;color:#5A6A7A;font-size:14px;'&gt;
+    No matching businesses found. Try broadening the channel description
+    or selecting a different city.
+  &lt;/div&gt;
+  {% endif %}
+&lt;/div&gt;
+{% endif %}</w:t>
+      </w:r>
+    </w:p>
+    <w:p>
+      <w:pPr>
+        <w:spacing w:after="0" w:before="60"/>
+      </w:pPr>
+    </w:p>
+    <w:p>
+      <w:pPr>
+        <w:pStyle w:val="Heading2"/>
+        <w:spacing w:after="120" w:before="280"/>
+      </w:pPr>
+      <w:r>
+        <w:rPr>
+          <w:rFonts w:ascii="Arial" w:cs="Arial" w:eastAsia="Arial" w:hAnsi="Arial"/>
+          <w:b/>
+          <w:bCs/>
+          <w:color w:val="2E7D8C"/>
+          <w:sz w:val="28"/>
+          <w:szCs w:val="28"/>
+        </w:rPr>
+        <w:t xml:space="preserve">4.8 New DB Tables — Partner CRM</w:t>
+      </w:r>
+    </w:p>
+    <w:p>
+      <w:pPr>
+        <w:spacing w:after="60" w:before="60"/>
+        <w:jc w:val="left"/>
+      </w:pPr>
+      <w:r>
+        <w:rPr>
+          <w:rFonts w:ascii="Arial" w:cs="Arial" w:eastAsia="Arial" w:hAnsi="Arial"/>
+          <w:color w:val="1C1C1E"/>
+          <w:sz w:val="22"/>
+          <w:szCs w:val="22"/>
+        </w:rPr>
+        <w:t xml:space="preserve">The partners table gains two additional columns in v1.1 to track how each record was discovered:</w:t>
       </w:r>
     </w:p>
     <w:tbl>
@@ -19044,40 +20135,40 @@
                 <w:sz w:val="18"/>
                 <w:szCs w:val="18"/>
               </w:rPr>
-              <w:t xml:space="preserve">location_city</w:t>
-            </w:r>
-          </w:p>
-        </w:tc>
-        <w:tc>
-          <w:tcPr>
-            <w:tcBorders>
-              <w:top w:val="single" w:color="CCCCCC" w:sz="1"/>
-              <w:left w:val="single" w:color="CCCCCC" w:sz="1"/>
-              <w:bottom w:val="single" w:color="CCCCCC" w:sz="1"/>
-              <w:right w:val="single" w:color="CCCCCC" w:sz="1"/>
-            </w:tcBorders>
-            <w:shd w:fill="FFFFFF" w:val="clear"/>
-            <w:tcMar>
-              <w:top w:type="dxa" w:w="60"/>
-              <w:left w:type="dxa" w:w="90"/>
-              <w:bottom w:type="dxa" w:w="60"/>
-              <w:right w:type="dxa" w:w="90"/>
-            </w:tcMar>
-          </w:tcPr>
-          <w:p>
-            <w:pPr>
-              <w:jc w:val="left"/>
-            </w:pPr>
-            <w:r>
-              <w:rPr>
-                <w:rFonts w:ascii="Arial" w:cs="Arial" w:eastAsia="Arial" w:hAnsi="Arial"/>
-                <w:b w:val="false"/>
-                <w:bCs w:val="false"/>
-                <w:color w:val="1C1C1E"/>
-                <w:sz w:val="18"/>
-                <w:szCs w:val="18"/>
-              </w:rPr>
-              <w:t xml:space="preserve">VARCHAR(100)</w:t>
+              <w:t xml:space="preserve">website</w:t>
+            </w:r>
+          </w:p>
+        </w:tc>
+        <w:tc>
+          <w:tcPr>
+            <w:tcBorders>
+              <w:top w:val="single" w:color="CCCCCC" w:sz="1"/>
+              <w:left w:val="single" w:color="CCCCCC" w:sz="1"/>
+              <w:bottom w:val="single" w:color="CCCCCC" w:sz="1"/>
+              <w:right w:val="single" w:color="CCCCCC" w:sz="1"/>
+            </w:tcBorders>
+            <w:shd w:fill="FFFFFF" w:val="clear"/>
+            <w:tcMar>
+              <w:top w:type="dxa" w:w="60"/>
+              <w:left w:type="dxa" w:w="90"/>
+              <w:bottom w:type="dxa" w:w="60"/>
+              <w:right w:type="dxa" w:w="90"/>
+            </w:tcMar>
+          </w:tcPr>
+          <w:p>
+            <w:pPr>
+              <w:jc w:val="left"/>
+            </w:pPr>
+            <w:r>
+              <w:rPr>
+                <w:rFonts w:ascii="Arial" w:cs="Arial" w:eastAsia="Arial" w:hAnsi="Arial"/>
+                <w:b w:val="false"/>
+                <w:bCs w:val="false"/>
+                <w:color w:val="1C1C1E"/>
+                <w:sz w:val="18"/>
+                <w:szCs w:val="18"/>
+              </w:rPr>
+              <w:t xml:space="preserve">VARCHAR(500)</w:t>
             </w:r>
           </w:p>
         </w:tc>
@@ -19143,7 +20234,7 @@
                 <w:sz w:val="18"/>
                 <w:szCs w:val="18"/>
               </w:rPr>
-              <w:t xml:space="preserve"/>
+              <w:t xml:space="preserve">NEW in v1.1 — extracted by web search agent</w:t>
             </w:r>
           </w:p>
         </w:tc>
@@ -19178,73 +20269,73 @@
                 <w:sz w:val="18"/>
                 <w:szCs w:val="18"/>
               </w:rPr>
-              <w:t xml:space="preserve">status</w:t>
-            </w:r>
-          </w:p>
-        </w:tc>
-        <w:tc>
-          <w:tcPr>
-            <w:tcBorders>
-              <w:top w:val="single" w:color="CCCCCC" w:sz="1"/>
-              <w:left w:val="single" w:color="CCCCCC" w:sz="1"/>
-              <w:bottom w:val="single" w:color="CCCCCC" w:sz="1"/>
-              <w:right w:val="single" w:color="CCCCCC" w:sz="1"/>
-            </w:tcBorders>
-            <w:shd w:fill="EFF4F9" w:val="clear"/>
-            <w:tcMar>
-              <w:top w:type="dxa" w:w="60"/>
-              <w:left w:type="dxa" w:w="90"/>
-              <w:bottom w:type="dxa" w:w="60"/>
-              <w:right w:type="dxa" w:w="90"/>
-            </w:tcMar>
-          </w:tcPr>
-          <w:p>
-            <w:pPr>
-              <w:jc w:val="left"/>
-            </w:pPr>
-            <w:r>
-              <w:rPr>
-                <w:rFonts w:ascii="Arial" w:cs="Arial" w:eastAsia="Arial" w:hAnsi="Arial"/>
-                <w:b w:val="false"/>
-                <w:bCs w:val="false"/>
-                <w:color w:val="1C1C1E"/>
-                <w:sz w:val="18"/>
-                <w:szCs w:val="18"/>
-              </w:rPr>
-              <w:t xml:space="preserve">ENUM('prospect','contacted','active','paused','declined')</w:t>
-            </w:r>
-          </w:p>
-        </w:tc>
-        <w:tc>
-          <w:tcPr>
-            <w:tcBorders>
-              <w:top w:val="single" w:color="CCCCCC" w:sz="1"/>
-              <w:left w:val="single" w:color="CCCCCC" w:sz="1"/>
-              <w:bottom w:val="single" w:color="CCCCCC" w:sz="1"/>
-              <w:right w:val="single" w:color="CCCCCC" w:sz="1"/>
-            </w:tcBorders>
-            <w:shd w:fill="EFF4F9" w:val="clear"/>
-            <w:tcMar>
-              <w:top w:type="dxa" w:w="60"/>
-              <w:left w:type="dxa" w:w="90"/>
-              <w:bottom w:type="dxa" w:w="60"/>
-              <w:right w:type="dxa" w:w="90"/>
-            </w:tcMar>
-          </w:tcPr>
-          <w:p>
-            <w:pPr>
-              <w:jc w:val="left"/>
-            </w:pPr>
-            <w:r>
-              <w:rPr>
-                <w:rFonts w:ascii="Arial" w:cs="Arial" w:eastAsia="Arial" w:hAnsi="Arial"/>
-                <w:b w:val="false"/>
-                <w:bCs w:val="false"/>
-                <w:color w:val="1C1C1E"/>
-                <w:sz w:val="18"/>
-                <w:szCs w:val="18"/>
-              </w:rPr>
-              <w:t xml:space="preserve">DEFAULT 'prospect'</w:t>
+              <w:t xml:space="preserve">location_city</w:t>
+            </w:r>
+          </w:p>
+        </w:tc>
+        <w:tc>
+          <w:tcPr>
+            <w:tcBorders>
+              <w:top w:val="single" w:color="CCCCCC" w:sz="1"/>
+              <w:left w:val="single" w:color="CCCCCC" w:sz="1"/>
+              <w:bottom w:val="single" w:color="CCCCCC" w:sz="1"/>
+              <w:right w:val="single" w:color="CCCCCC" w:sz="1"/>
+            </w:tcBorders>
+            <w:shd w:fill="EFF4F9" w:val="clear"/>
+            <w:tcMar>
+              <w:top w:type="dxa" w:w="60"/>
+              <w:left w:type="dxa" w:w="90"/>
+              <w:bottom w:type="dxa" w:w="60"/>
+              <w:right w:type="dxa" w:w="90"/>
+            </w:tcMar>
+          </w:tcPr>
+          <w:p>
+            <w:pPr>
+              <w:jc w:val="left"/>
+            </w:pPr>
+            <w:r>
+              <w:rPr>
+                <w:rFonts w:ascii="Arial" w:cs="Arial" w:eastAsia="Arial" w:hAnsi="Arial"/>
+                <w:b w:val="false"/>
+                <w:bCs w:val="false"/>
+                <w:color w:val="1C1C1E"/>
+                <w:sz w:val="18"/>
+                <w:szCs w:val="18"/>
+              </w:rPr>
+              <w:t xml:space="preserve">VARCHAR(100)</w:t>
+            </w:r>
+          </w:p>
+        </w:tc>
+        <w:tc>
+          <w:tcPr>
+            <w:tcBorders>
+              <w:top w:val="single" w:color="CCCCCC" w:sz="1"/>
+              <w:left w:val="single" w:color="CCCCCC" w:sz="1"/>
+              <w:bottom w:val="single" w:color="CCCCCC" w:sz="1"/>
+              <w:right w:val="single" w:color="CCCCCC" w:sz="1"/>
+            </w:tcBorders>
+            <w:shd w:fill="EFF4F9" w:val="clear"/>
+            <w:tcMar>
+              <w:top w:type="dxa" w:w="60"/>
+              <w:left w:type="dxa" w:w="90"/>
+              <w:bottom w:type="dxa" w:w="60"/>
+              <w:right w:type="dxa" w:w="90"/>
+            </w:tcMar>
+          </w:tcPr>
+          <w:p>
+            <w:pPr>
+              <w:jc w:val="left"/>
+            </w:pPr>
+            <w:r>
+              <w:rPr>
+                <w:rFonts w:ascii="Arial" w:cs="Arial" w:eastAsia="Arial" w:hAnsi="Arial"/>
+                <w:b w:val="false"/>
+                <w:bCs w:val="false"/>
+                <w:color w:val="1C1C1E"/>
+                <w:sz w:val="18"/>
+                <w:szCs w:val="18"/>
+              </w:rPr>
+              <w:t xml:space="preserve">NULLABLE</w:t>
             </w:r>
           </w:p>
         </w:tc>
@@ -19312,40 +20403,40 @@
                 <w:sz w:val="18"/>
                 <w:szCs w:val="18"/>
               </w:rPr>
-              <w:t xml:space="preserve">commission_rate</w:t>
-            </w:r>
-          </w:p>
-        </w:tc>
-        <w:tc>
-          <w:tcPr>
-            <w:tcBorders>
-              <w:top w:val="single" w:color="CCCCCC" w:sz="1"/>
-              <w:left w:val="single" w:color="CCCCCC" w:sz="1"/>
-              <w:bottom w:val="single" w:color="CCCCCC" w:sz="1"/>
-              <w:right w:val="single" w:color="CCCCCC" w:sz="1"/>
-            </w:tcBorders>
-            <w:shd w:fill="FFFFFF" w:val="clear"/>
-            <w:tcMar>
-              <w:top w:type="dxa" w:w="60"/>
-              <w:left w:type="dxa" w:w="90"/>
-              <w:bottom w:type="dxa" w:w="60"/>
-              <w:right w:type="dxa" w:w="90"/>
-            </w:tcMar>
-          </w:tcPr>
-          <w:p>
-            <w:pPr>
-              <w:jc w:val="left"/>
-            </w:pPr>
-            <w:r>
-              <w:rPr>
-                <w:rFonts w:ascii="Arial" w:cs="Arial" w:eastAsia="Arial" w:hAnsi="Arial"/>
-                <w:b w:val="false"/>
-                <w:bCs w:val="false"/>
-                <w:color w:val="1C1C1E"/>
-                <w:sz w:val="18"/>
-                <w:szCs w:val="18"/>
-              </w:rPr>
-              <w:t xml:space="preserve">DECIMAL(5,2)</w:t>
+              <w:t xml:space="preserve">location_address</w:t>
+            </w:r>
+          </w:p>
+        </w:tc>
+        <w:tc>
+          <w:tcPr>
+            <w:tcBorders>
+              <w:top w:val="single" w:color="CCCCCC" w:sz="1"/>
+              <w:left w:val="single" w:color="CCCCCC" w:sz="1"/>
+              <w:bottom w:val="single" w:color="CCCCCC" w:sz="1"/>
+              <w:right w:val="single" w:color="CCCCCC" w:sz="1"/>
+            </w:tcBorders>
+            <w:shd w:fill="FFFFFF" w:val="clear"/>
+            <w:tcMar>
+              <w:top w:type="dxa" w:w="60"/>
+              <w:left w:type="dxa" w:w="90"/>
+              <w:bottom w:type="dxa" w:w="60"/>
+              <w:right w:type="dxa" w:w="90"/>
+            </w:tcMar>
+          </w:tcPr>
+          <w:p>
+            <w:pPr>
+              <w:jc w:val="left"/>
+            </w:pPr>
+            <w:r>
+              <w:rPr>
+                <w:rFonts w:ascii="Arial" w:cs="Arial" w:eastAsia="Arial" w:hAnsi="Arial"/>
+                <w:b w:val="false"/>
+                <w:bCs w:val="false"/>
+                <w:color w:val="1C1C1E"/>
+                <w:sz w:val="18"/>
+                <w:szCs w:val="18"/>
+              </w:rPr>
+              <w:t xml:space="preserve">VARCHAR(300)</w:t>
             </w:r>
           </w:p>
         </w:tc>
@@ -19411,7 +20502,7 @@
                 <w:sz w:val="18"/>
                 <w:szCs w:val="18"/>
               </w:rPr>
-              <w:t xml:space="preserve">Agreed referral commission %</w:t>
+              <w:t xml:space="preserve">NEW in v1.1 — extracted by web search agent</w:t>
             </w:r>
           </w:p>
         </w:tc>
@@ -19446,106 +20537,106 @@
                 <w:sz w:val="18"/>
                 <w:szCs w:val="18"/>
               </w:rPr>
-              <w:t xml:space="preserve">notes</w:t>
-            </w:r>
-          </w:p>
-        </w:tc>
-        <w:tc>
-          <w:tcPr>
-            <w:tcBorders>
-              <w:top w:val="single" w:color="CCCCCC" w:sz="1"/>
-              <w:left w:val="single" w:color="CCCCCC" w:sz="1"/>
-              <w:bottom w:val="single" w:color="CCCCCC" w:sz="1"/>
-              <w:right w:val="single" w:color="CCCCCC" w:sz="1"/>
-            </w:tcBorders>
-            <w:shd w:fill="EFF4F9" w:val="clear"/>
-            <w:tcMar>
-              <w:top w:type="dxa" w:w="60"/>
-              <w:left w:type="dxa" w:w="90"/>
-              <w:bottom w:type="dxa" w:w="60"/>
-              <w:right w:type="dxa" w:w="90"/>
-            </w:tcMar>
-          </w:tcPr>
-          <w:p>
-            <w:pPr>
-              <w:jc w:val="left"/>
-            </w:pPr>
-            <w:r>
-              <w:rPr>
-                <w:rFonts w:ascii="Arial" w:cs="Arial" w:eastAsia="Arial" w:hAnsi="Arial"/>
-                <w:b w:val="false"/>
-                <w:bCs w:val="false"/>
-                <w:color w:val="1C1C1E"/>
-                <w:sz w:val="18"/>
-                <w:szCs w:val="18"/>
-              </w:rPr>
-              <w:t xml:space="preserve">TEXT</w:t>
-            </w:r>
-          </w:p>
-        </w:tc>
-        <w:tc>
-          <w:tcPr>
-            <w:tcBorders>
-              <w:top w:val="single" w:color="CCCCCC" w:sz="1"/>
-              <w:left w:val="single" w:color="CCCCCC" w:sz="1"/>
-              <w:bottom w:val="single" w:color="CCCCCC" w:sz="1"/>
-              <w:right w:val="single" w:color="CCCCCC" w:sz="1"/>
-            </w:tcBorders>
-            <w:shd w:fill="EFF4F9" w:val="clear"/>
-            <w:tcMar>
-              <w:top w:type="dxa" w:w="60"/>
-              <w:left w:type="dxa" w:w="90"/>
-              <w:bottom w:type="dxa" w:w="60"/>
-              <w:right w:type="dxa" w:w="90"/>
-            </w:tcMar>
-          </w:tcPr>
-          <w:p>
-            <w:pPr>
-              <w:jc w:val="left"/>
-            </w:pPr>
-            <w:r>
-              <w:rPr>
-                <w:rFonts w:ascii="Arial" w:cs="Arial" w:eastAsia="Arial" w:hAnsi="Arial"/>
-                <w:b w:val="false"/>
-                <w:bCs w:val="false"/>
-                <w:color w:val="1C1C1E"/>
-                <w:sz w:val="18"/>
-                <w:szCs w:val="18"/>
-              </w:rPr>
-              <w:t xml:space="preserve">NULLABLE</w:t>
-            </w:r>
-          </w:p>
-        </w:tc>
-        <w:tc>
-          <w:tcPr>
-            <w:tcBorders>
-              <w:top w:val="single" w:color="CCCCCC" w:sz="1"/>
-              <w:left w:val="single" w:color="CCCCCC" w:sz="1"/>
-              <w:bottom w:val="single" w:color="CCCCCC" w:sz="1"/>
-              <w:right w:val="single" w:color="CCCCCC" w:sz="1"/>
-            </w:tcBorders>
-            <w:shd w:fill="EFF4F9" w:val="clear"/>
-            <w:tcMar>
-              <w:top w:type="dxa" w:w="60"/>
-              <w:left w:type="dxa" w:w="90"/>
-              <w:bottom w:type="dxa" w:w="60"/>
-              <w:right w:type="dxa" w:w="90"/>
-            </w:tcMar>
-          </w:tcPr>
-          <w:p>
-            <w:pPr>
-              <w:jc w:val="left"/>
-            </w:pPr>
-            <w:r>
-              <w:rPr>
-                <w:rFonts w:ascii="Arial" w:cs="Arial" w:eastAsia="Arial" w:hAnsi="Arial"/>
-                <w:b w:val="false"/>
-                <w:bCs w:val="false"/>
-                <w:color w:val="1C1C1E"/>
-                <w:sz w:val="18"/>
-                <w:szCs w:val="18"/>
-              </w:rPr>
-              <w:t xml:space="preserve">Internal notes</w:t>
+              <w:t xml:space="preserve">status</w:t>
+            </w:r>
+          </w:p>
+        </w:tc>
+        <w:tc>
+          <w:tcPr>
+            <w:tcBorders>
+              <w:top w:val="single" w:color="CCCCCC" w:sz="1"/>
+              <w:left w:val="single" w:color="CCCCCC" w:sz="1"/>
+              <w:bottom w:val="single" w:color="CCCCCC" w:sz="1"/>
+              <w:right w:val="single" w:color="CCCCCC" w:sz="1"/>
+            </w:tcBorders>
+            <w:shd w:fill="EFF4F9" w:val="clear"/>
+            <w:tcMar>
+              <w:top w:type="dxa" w:w="60"/>
+              <w:left w:type="dxa" w:w="90"/>
+              <w:bottom w:type="dxa" w:w="60"/>
+              <w:right w:type="dxa" w:w="90"/>
+            </w:tcMar>
+          </w:tcPr>
+          <w:p>
+            <w:pPr>
+              <w:jc w:val="left"/>
+            </w:pPr>
+            <w:r>
+              <w:rPr>
+                <w:rFonts w:ascii="Arial" w:cs="Arial" w:eastAsia="Arial" w:hAnsi="Arial"/>
+                <w:b w:val="false"/>
+                <w:bCs w:val="false"/>
+                <w:color w:val="1C1C1E"/>
+                <w:sz w:val="18"/>
+                <w:szCs w:val="18"/>
+              </w:rPr>
+              <w:t xml:space="preserve">ENUM('prospect','contacted','active','paused','declined')</w:t>
+            </w:r>
+          </w:p>
+        </w:tc>
+        <w:tc>
+          <w:tcPr>
+            <w:tcBorders>
+              <w:top w:val="single" w:color="CCCCCC" w:sz="1"/>
+              <w:left w:val="single" w:color="CCCCCC" w:sz="1"/>
+              <w:bottom w:val="single" w:color="CCCCCC" w:sz="1"/>
+              <w:right w:val="single" w:color="CCCCCC" w:sz="1"/>
+            </w:tcBorders>
+            <w:shd w:fill="EFF4F9" w:val="clear"/>
+            <w:tcMar>
+              <w:top w:type="dxa" w:w="60"/>
+              <w:left w:type="dxa" w:w="90"/>
+              <w:bottom w:type="dxa" w:w="60"/>
+              <w:right w:type="dxa" w:w="90"/>
+            </w:tcMar>
+          </w:tcPr>
+          <w:p>
+            <w:pPr>
+              <w:jc w:val="left"/>
+            </w:pPr>
+            <w:r>
+              <w:rPr>
+                <w:rFonts w:ascii="Arial" w:cs="Arial" w:eastAsia="Arial" w:hAnsi="Arial"/>
+                <w:b w:val="false"/>
+                <w:bCs w:val="false"/>
+                <w:color w:val="1C1C1E"/>
+                <w:sz w:val="18"/>
+                <w:szCs w:val="18"/>
+              </w:rPr>
+              <w:t xml:space="preserve">DEFAULT 'prospect'</w:t>
+            </w:r>
+          </w:p>
+        </w:tc>
+        <w:tc>
+          <w:tcPr>
+            <w:tcBorders>
+              <w:top w:val="single" w:color="CCCCCC" w:sz="1"/>
+              <w:left w:val="single" w:color="CCCCCC" w:sz="1"/>
+              <w:bottom w:val="single" w:color="CCCCCC" w:sz="1"/>
+              <w:right w:val="single" w:color="CCCCCC" w:sz="1"/>
+            </w:tcBorders>
+            <w:shd w:fill="EFF4F9" w:val="clear"/>
+            <w:tcMar>
+              <w:top w:type="dxa" w:w="60"/>
+              <w:left w:type="dxa" w:w="90"/>
+              <w:bottom w:type="dxa" w:w="60"/>
+              <w:right w:type="dxa" w:w="90"/>
+            </w:tcMar>
+          </w:tcPr>
+          <w:p>
+            <w:pPr>
+              <w:jc w:val="left"/>
+            </w:pPr>
+            <w:r>
+              <w:rPr>
+                <w:rFonts w:ascii="Arial" w:cs="Arial" w:eastAsia="Arial" w:hAnsi="Arial"/>
+                <w:b w:val="false"/>
+                <w:bCs w:val="false"/>
+                <w:color w:val="1C1C1E"/>
+                <w:sz w:val="18"/>
+                <w:szCs w:val="18"/>
+              </w:rPr>
+              <w:t xml:space="preserve"/>
             </w:r>
           </w:p>
         </w:tc>
@@ -19580,106 +20671,106 @@
                 <w:sz w:val="18"/>
                 <w:szCs w:val="18"/>
               </w:rPr>
-              <w:t xml:space="preserve">last_contact_at</w:t>
-            </w:r>
-          </w:p>
-        </w:tc>
-        <w:tc>
-          <w:tcPr>
-            <w:tcBorders>
-              <w:top w:val="single" w:color="CCCCCC" w:sz="1"/>
-              <w:left w:val="single" w:color="CCCCCC" w:sz="1"/>
-              <w:bottom w:val="single" w:color="CCCCCC" w:sz="1"/>
-              <w:right w:val="single" w:color="CCCCCC" w:sz="1"/>
-            </w:tcBorders>
-            <w:shd w:fill="FFFFFF" w:val="clear"/>
-            <w:tcMar>
-              <w:top w:type="dxa" w:w="60"/>
-              <w:left w:type="dxa" w:w="90"/>
-              <w:bottom w:type="dxa" w:w="60"/>
-              <w:right w:type="dxa" w:w="90"/>
-            </w:tcMar>
-          </w:tcPr>
-          <w:p>
-            <w:pPr>
-              <w:jc w:val="left"/>
-            </w:pPr>
-            <w:r>
-              <w:rPr>
-                <w:rFonts w:ascii="Arial" w:cs="Arial" w:eastAsia="Arial" w:hAnsi="Arial"/>
-                <w:b w:val="false"/>
-                <w:bCs w:val="false"/>
-                <w:color w:val="1C1C1E"/>
-                <w:sz w:val="18"/>
-                <w:szCs w:val="18"/>
-              </w:rPr>
-              <w:t xml:space="preserve">DATETIME</w:t>
-            </w:r>
-          </w:p>
-        </w:tc>
-        <w:tc>
-          <w:tcPr>
-            <w:tcBorders>
-              <w:top w:val="single" w:color="CCCCCC" w:sz="1"/>
-              <w:left w:val="single" w:color="CCCCCC" w:sz="1"/>
-              <w:bottom w:val="single" w:color="CCCCCC" w:sz="1"/>
-              <w:right w:val="single" w:color="CCCCCC" w:sz="1"/>
-            </w:tcBorders>
-            <w:shd w:fill="FFFFFF" w:val="clear"/>
-            <w:tcMar>
-              <w:top w:type="dxa" w:w="60"/>
-              <w:left w:type="dxa" w:w="90"/>
-              <w:bottom w:type="dxa" w:w="60"/>
-              <w:right w:type="dxa" w:w="90"/>
-            </w:tcMar>
-          </w:tcPr>
-          <w:p>
-            <w:pPr>
-              <w:jc w:val="left"/>
-            </w:pPr>
-            <w:r>
-              <w:rPr>
-                <w:rFonts w:ascii="Arial" w:cs="Arial" w:eastAsia="Arial" w:hAnsi="Arial"/>
-                <w:b w:val="false"/>
-                <w:bCs w:val="false"/>
-                <w:color w:val="1C1C1E"/>
-                <w:sz w:val="18"/>
-                <w:szCs w:val="18"/>
-              </w:rPr>
-              <w:t xml:space="preserve">NULLABLE</w:t>
-            </w:r>
-          </w:p>
-        </w:tc>
-        <w:tc>
-          <w:tcPr>
-            <w:tcBorders>
-              <w:top w:val="single" w:color="CCCCCC" w:sz="1"/>
-              <w:left w:val="single" w:color="CCCCCC" w:sz="1"/>
-              <w:bottom w:val="single" w:color="CCCCCC" w:sz="1"/>
-              <w:right w:val="single" w:color="CCCCCC" w:sz="1"/>
-            </w:tcBorders>
-            <w:shd w:fill="FFFFFF" w:val="clear"/>
-            <w:tcMar>
-              <w:top w:type="dxa" w:w="60"/>
-              <w:left w:type="dxa" w:w="90"/>
-              <w:bottom w:type="dxa" w:w="60"/>
-              <w:right w:type="dxa" w:w="90"/>
-            </w:tcMar>
-          </w:tcPr>
-          <w:p>
-            <w:pPr>
-              <w:jc w:val="left"/>
-            </w:pPr>
-            <w:r>
-              <w:rPr>
-                <w:rFonts w:ascii="Arial" w:cs="Arial" w:eastAsia="Arial" w:hAnsi="Arial"/>
-                <w:b w:val="false"/>
-                <w:bCs w:val="false"/>
-                <w:color w:val="1C1C1E"/>
-                <w:sz w:val="18"/>
-                <w:szCs w:val="18"/>
-              </w:rPr>
-              <w:t xml:space="preserve">UTC — last outreach or reply</w:t>
+              <w:t xml:space="preserve">discovery_source</w:t>
+            </w:r>
+          </w:p>
+        </w:tc>
+        <w:tc>
+          <w:tcPr>
+            <w:tcBorders>
+              <w:top w:val="single" w:color="CCCCCC" w:sz="1"/>
+              <w:left w:val="single" w:color="CCCCCC" w:sz="1"/>
+              <w:bottom w:val="single" w:color="CCCCCC" w:sz="1"/>
+              <w:right w:val="single" w:color="CCCCCC" w:sz="1"/>
+            </w:tcBorders>
+            <w:shd w:fill="FFFFFF" w:val="clear"/>
+            <w:tcMar>
+              <w:top w:type="dxa" w:w="60"/>
+              <w:left w:type="dxa" w:w="90"/>
+              <w:bottom w:type="dxa" w:w="60"/>
+              <w:right w:type="dxa" w:w="90"/>
+            </w:tcMar>
+          </w:tcPr>
+          <w:p>
+            <w:pPr>
+              <w:jc w:val="left"/>
+            </w:pPr>
+            <w:r>
+              <w:rPr>
+                <w:rFonts w:ascii="Arial" w:cs="Arial" w:eastAsia="Arial" w:hAnsi="Arial"/>
+                <w:b w:val="false"/>
+                <w:bCs w:val="false"/>
+                <w:color w:val="1C1C1E"/>
+                <w:sz w:val="18"/>
+                <w:szCs w:val="18"/>
+              </w:rPr>
+              <w:t xml:space="preserve">ENUM('web_search','manual','referral')</w:t>
+            </w:r>
+          </w:p>
+        </w:tc>
+        <w:tc>
+          <w:tcPr>
+            <w:tcBorders>
+              <w:top w:val="single" w:color="CCCCCC" w:sz="1"/>
+              <w:left w:val="single" w:color="CCCCCC" w:sz="1"/>
+              <w:bottom w:val="single" w:color="CCCCCC" w:sz="1"/>
+              <w:right w:val="single" w:color="CCCCCC" w:sz="1"/>
+            </w:tcBorders>
+            <w:shd w:fill="FFFFFF" w:val="clear"/>
+            <w:tcMar>
+              <w:top w:type="dxa" w:w="60"/>
+              <w:left w:type="dxa" w:w="90"/>
+              <w:bottom w:type="dxa" w:w="60"/>
+              <w:right w:type="dxa" w:w="90"/>
+            </w:tcMar>
+          </w:tcPr>
+          <w:p>
+            <w:pPr>
+              <w:jc w:val="left"/>
+            </w:pPr>
+            <w:r>
+              <w:rPr>
+                <w:rFonts w:ascii="Arial" w:cs="Arial" w:eastAsia="Arial" w:hAnsi="Arial"/>
+                <w:b w:val="false"/>
+                <w:bCs w:val="false"/>
+                <w:color w:val="1C1C1E"/>
+                <w:sz w:val="18"/>
+                <w:szCs w:val="18"/>
+              </w:rPr>
+              <w:t xml:space="preserve">DEFAULT 'manual'</w:t>
+            </w:r>
+          </w:p>
+        </w:tc>
+        <w:tc>
+          <w:tcPr>
+            <w:tcBorders>
+              <w:top w:val="single" w:color="CCCCCC" w:sz="1"/>
+              <w:left w:val="single" w:color="CCCCCC" w:sz="1"/>
+              <w:bottom w:val="single" w:color="CCCCCC" w:sz="1"/>
+              <w:right w:val="single" w:color="CCCCCC" w:sz="1"/>
+            </w:tcBorders>
+            <w:shd w:fill="FFFFFF" w:val="clear"/>
+            <w:tcMar>
+              <w:top w:type="dxa" w:w="60"/>
+              <w:left w:type="dxa" w:w="90"/>
+              <w:bottom w:type="dxa" w:w="60"/>
+              <w:right w:type="dxa" w:w="90"/>
+            </w:tcMar>
+          </w:tcPr>
+          <w:p>
+            <w:pPr>
+              <w:jc w:val="left"/>
+            </w:pPr>
+            <w:r>
+              <w:rPr>
+                <w:rFonts w:ascii="Arial" w:cs="Arial" w:eastAsia="Arial" w:hAnsi="Arial"/>
+                <w:b w:val="false"/>
+                <w:bCs w:val="false"/>
+                <w:color w:val="1C1C1E"/>
+                <w:sz w:val="18"/>
+                <w:szCs w:val="18"/>
+              </w:rPr>
+              <w:t xml:space="preserve">NEW in v1.1 — how the partner was added</w:t>
             </w:r>
           </w:p>
         </w:tc>
@@ -19714,6 +20805,542 @@
                 <w:sz w:val="18"/>
                 <w:szCs w:val="18"/>
               </w:rPr>
+              <w:t xml:space="preserve">discovery_search_query</w:t>
+            </w:r>
+          </w:p>
+        </w:tc>
+        <w:tc>
+          <w:tcPr>
+            <w:tcBorders>
+              <w:top w:val="single" w:color="CCCCCC" w:sz="1"/>
+              <w:left w:val="single" w:color="CCCCCC" w:sz="1"/>
+              <w:bottom w:val="single" w:color="CCCCCC" w:sz="1"/>
+              <w:right w:val="single" w:color="CCCCCC" w:sz="1"/>
+            </w:tcBorders>
+            <w:shd w:fill="EFF4F9" w:val="clear"/>
+            <w:tcMar>
+              <w:top w:type="dxa" w:w="60"/>
+              <w:left w:type="dxa" w:w="90"/>
+              <w:bottom w:type="dxa" w:w="60"/>
+              <w:right w:type="dxa" w:w="90"/>
+            </w:tcMar>
+          </w:tcPr>
+          <w:p>
+            <w:pPr>
+              <w:jc w:val="left"/>
+            </w:pPr>
+            <w:r>
+              <w:rPr>
+                <w:rFonts w:ascii="Arial" w:cs="Arial" w:eastAsia="Arial" w:hAnsi="Arial"/>
+                <w:b w:val="false"/>
+                <w:bCs w:val="false"/>
+                <w:color w:val="1C1C1E"/>
+                <w:sz w:val="18"/>
+                <w:szCs w:val="18"/>
+              </w:rPr>
+              <w:t xml:space="preserve">TEXT</w:t>
+            </w:r>
+          </w:p>
+        </w:tc>
+        <w:tc>
+          <w:tcPr>
+            <w:tcBorders>
+              <w:top w:val="single" w:color="CCCCCC" w:sz="1"/>
+              <w:left w:val="single" w:color="CCCCCC" w:sz="1"/>
+              <w:bottom w:val="single" w:color="CCCCCC" w:sz="1"/>
+              <w:right w:val="single" w:color="CCCCCC" w:sz="1"/>
+            </w:tcBorders>
+            <w:shd w:fill="EFF4F9" w:val="clear"/>
+            <w:tcMar>
+              <w:top w:type="dxa" w:w="60"/>
+              <w:left w:type="dxa" w:w="90"/>
+              <w:bottom w:type="dxa" w:w="60"/>
+              <w:right w:type="dxa" w:w="90"/>
+            </w:tcMar>
+          </w:tcPr>
+          <w:p>
+            <w:pPr>
+              <w:jc w:val="left"/>
+            </w:pPr>
+            <w:r>
+              <w:rPr>
+                <w:rFonts w:ascii="Arial" w:cs="Arial" w:eastAsia="Arial" w:hAnsi="Arial"/>
+                <w:b w:val="false"/>
+                <w:bCs w:val="false"/>
+                <w:color w:val="1C1C1E"/>
+                <w:sz w:val="18"/>
+                <w:szCs w:val="18"/>
+              </w:rPr>
+              <w:t xml:space="preserve">NULLABLE</w:t>
+            </w:r>
+          </w:p>
+        </w:tc>
+        <w:tc>
+          <w:tcPr>
+            <w:tcBorders>
+              <w:top w:val="single" w:color="CCCCCC" w:sz="1"/>
+              <w:left w:val="single" w:color="CCCCCC" w:sz="1"/>
+              <w:bottom w:val="single" w:color="CCCCCC" w:sz="1"/>
+              <w:right w:val="single" w:color="CCCCCC" w:sz="1"/>
+            </w:tcBorders>
+            <w:shd w:fill="EFF4F9" w:val="clear"/>
+            <w:tcMar>
+              <w:top w:type="dxa" w:w="60"/>
+              <w:left w:type="dxa" w:w="90"/>
+              <w:bottom w:type="dxa" w:w="60"/>
+              <w:right w:type="dxa" w:w="90"/>
+            </w:tcMar>
+          </w:tcPr>
+          <w:p>
+            <w:pPr>
+              <w:jc w:val="left"/>
+            </w:pPr>
+            <w:r>
+              <w:rPr>
+                <w:rFonts w:ascii="Arial" w:cs="Arial" w:eastAsia="Arial" w:hAnsi="Arial"/>
+                <w:b w:val="false"/>
+                <w:bCs w:val="false"/>
+                <w:color w:val="1C1C1E"/>
+                <w:sz w:val="18"/>
+                <w:szCs w:val="18"/>
+              </w:rPr>
+              <w:t xml:space="preserve">NEW in v1.1 — the channel_description used to find this partner</w:t>
+            </w:r>
+          </w:p>
+        </w:tc>
+      </w:tr>
+      <w:tr>
+        <w:tc>
+          <w:tcPr>
+            <w:tcBorders>
+              <w:top w:val="single" w:color="CCCCCC" w:sz="1"/>
+              <w:left w:val="single" w:color="CCCCCC" w:sz="1"/>
+              <w:bottom w:val="single" w:color="CCCCCC" w:sz="1"/>
+              <w:right w:val="single" w:color="CCCCCC" w:sz="1"/>
+            </w:tcBorders>
+            <w:shd w:fill="FFFFFF" w:val="clear"/>
+            <w:tcMar>
+              <w:top w:type="dxa" w:w="60"/>
+              <w:left w:type="dxa" w:w="90"/>
+              <w:bottom w:type="dxa" w:w="60"/>
+              <w:right w:type="dxa" w:w="90"/>
+            </w:tcMar>
+          </w:tcPr>
+          <w:p>
+            <w:pPr>
+              <w:jc w:val="left"/>
+            </w:pPr>
+            <w:r>
+              <w:rPr>
+                <w:rFonts w:ascii="Arial" w:cs="Arial" w:eastAsia="Arial" w:hAnsi="Arial"/>
+                <w:b/>
+                <w:bCs/>
+                <w:color w:val="1A3557"/>
+                <w:sz w:val="18"/>
+                <w:szCs w:val="18"/>
+              </w:rPr>
+              <w:t xml:space="preserve">commission_rate</w:t>
+            </w:r>
+          </w:p>
+        </w:tc>
+        <w:tc>
+          <w:tcPr>
+            <w:tcBorders>
+              <w:top w:val="single" w:color="CCCCCC" w:sz="1"/>
+              <w:left w:val="single" w:color="CCCCCC" w:sz="1"/>
+              <w:bottom w:val="single" w:color="CCCCCC" w:sz="1"/>
+              <w:right w:val="single" w:color="CCCCCC" w:sz="1"/>
+            </w:tcBorders>
+            <w:shd w:fill="FFFFFF" w:val="clear"/>
+            <w:tcMar>
+              <w:top w:type="dxa" w:w="60"/>
+              <w:left w:type="dxa" w:w="90"/>
+              <w:bottom w:type="dxa" w:w="60"/>
+              <w:right w:type="dxa" w:w="90"/>
+            </w:tcMar>
+          </w:tcPr>
+          <w:p>
+            <w:pPr>
+              <w:jc w:val="left"/>
+            </w:pPr>
+            <w:r>
+              <w:rPr>
+                <w:rFonts w:ascii="Arial" w:cs="Arial" w:eastAsia="Arial" w:hAnsi="Arial"/>
+                <w:b w:val="false"/>
+                <w:bCs w:val="false"/>
+                <w:color w:val="1C1C1E"/>
+                <w:sz w:val="18"/>
+                <w:szCs w:val="18"/>
+              </w:rPr>
+              <w:t xml:space="preserve">DECIMAL(5,2)</w:t>
+            </w:r>
+          </w:p>
+        </w:tc>
+        <w:tc>
+          <w:tcPr>
+            <w:tcBorders>
+              <w:top w:val="single" w:color="CCCCCC" w:sz="1"/>
+              <w:left w:val="single" w:color="CCCCCC" w:sz="1"/>
+              <w:bottom w:val="single" w:color="CCCCCC" w:sz="1"/>
+              <w:right w:val="single" w:color="CCCCCC" w:sz="1"/>
+            </w:tcBorders>
+            <w:shd w:fill="FFFFFF" w:val="clear"/>
+            <w:tcMar>
+              <w:top w:type="dxa" w:w="60"/>
+              <w:left w:type="dxa" w:w="90"/>
+              <w:bottom w:type="dxa" w:w="60"/>
+              <w:right w:type="dxa" w:w="90"/>
+            </w:tcMar>
+          </w:tcPr>
+          <w:p>
+            <w:pPr>
+              <w:jc w:val="left"/>
+            </w:pPr>
+            <w:r>
+              <w:rPr>
+                <w:rFonts w:ascii="Arial" w:cs="Arial" w:eastAsia="Arial" w:hAnsi="Arial"/>
+                <w:b w:val="false"/>
+                <w:bCs w:val="false"/>
+                <w:color w:val="1C1C1E"/>
+                <w:sz w:val="18"/>
+                <w:szCs w:val="18"/>
+              </w:rPr>
+              <w:t xml:space="preserve">NULLABLE</w:t>
+            </w:r>
+          </w:p>
+        </w:tc>
+        <w:tc>
+          <w:tcPr>
+            <w:tcBorders>
+              <w:top w:val="single" w:color="CCCCCC" w:sz="1"/>
+              <w:left w:val="single" w:color="CCCCCC" w:sz="1"/>
+              <w:bottom w:val="single" w:color="CCCCCC" w:sz="1"/>
+              <w:right w:val="single" w:color="CCCCCC" w:sz="1"/>
+            </w:tcBorders>
+            <w:shd w:fill="FFFFFF" w:val="clear"/>
+            <w:tcMar>
+              <w:top w:type="dxa" w:w="60"/>
+              <w:left w:type="dxa" w:w="90"/>
+              <w:bottom w:type="dxa" w:w="60"/>
+              <w:right w:type="dxa" w:w="90"/>
+            </w:tcMar>
+          </w:tcPr>
+          <w:p>
+            <w:pPr>
+              <w:jc w:val="left"/>
+            </w:pPr>
+            <w:r>
+              <w:rPr>
+                <w:rFonts w:ascii="Arial" w:cs="Arial" w:eastAsia="Arial" w:hAnsi="Arial"/>
+                <w:b w:val="false"/>
+                <w:bCs w:val="false"/>
+                <w:color w:val="1C1C1E"/>
+                <w:sz w:val="18"/>
+                <w:szCs w:val="18"/>
+              </w:rPr>
+              <w:t xml:space="preserve">Agreed referral commission %</w:t>
+            </w:r>
+          </w:p>
+        </w:tc>
+      </w:tr>
+      <w:tr>
+        <w:tc>
+          <w:tcPr>
+            <w:tcBorders>
+              <w:top w:val="single" w:color="CCCCCC" w:sz="1"/>
+              <w:left w:val="single" w:color="CCCCCC" w:sz="1"/>
+              <w:bottom w:val="single" w:color="CCCCCC" w:sz="1"/>
+              <w:right w:val="single" w:color="CCCCCC" w:sz="1"/>
+            </w:tcBorders>
+            <w:shd w:fill="EFF4F9" w:val="clear"/>
+            <w:tcMar>
+              <w:top w:type="dxa" w:w="60"/>
+              <w:left w:type="dxa" w:w="90"/>
+              <w:bottom w:type="dxa" w:w="60"/>
+              <w:right w:type="dxa" w:w="90"/>
+            </w:tcMar>
+          </w:tcPr>
+          <w:p>
+            <w:pPr>
+              <w:jc w:val="left"/>
+            </w:pPr>
+            <w:r>
+              <w:rPr>
+                <w:rFonts w:ascii="Arial" w:cs="Arial" w:eastAsia="Arial" w:hAnsi="Arial"/>
+                <w:b/>
+                <w:bCs/>
+                <w:color w:val="1A3557"/>
+                <w:sz w:val="18"/>
+                <w:szCs w:val="18"/>
+              </w:rPr>
+              <w:t xml:space="preserve">notes</w:t>
+            </w:r>
+          </w:p>
+        </w:tc>
+        <w:tc>
+          <w:tcPr>
+            <w:tcBorders>
+              <w:top w:val="single" w:color="CCCCCC" w:sz="1"/>
+              <w:left w:val="single" w:color="CCCCCC" w:sz="1"/>
+              <w:bottom w:val="single" w:color="CCCCCC" w:sz="1"/>
+              <w:right w:val="single" w:color="CCCCCC" w:sz="1"/>
+            </w:tcBorders>
+            <w:shd w:fill="EFF4F9" w:val="clear"/>
+            <w:tcMar>
+              <w:top w:type="dxa" w:w="60"/>
+              <w:left w:type="dxa" w:w="90"/>
+              <w:bottom w:type="dxa" w:w="60"/>
+              <w:right w:type="dxa" w:w="90"/>
+            </w:tcMar>
+          </w:tcPr>
+          <w:p>
+            <w:pPr>
+              <w:jc w:val="left"/>
+            </w:pPr>
+            <w:r>
+              <w:rPr>
+                <w:rFonts w:ascii="Arial" w:cs="Arial" w:eastAsia="Arial" w:hAnsi="Arial"/>
+                <w:b w:val="false"/>
+                <w:bCs w:val="false"/>
+                <w:color w:val="1C1C1E"/>
+                <w:sz w:val="18"/>
+                <w:szCs w:val="18"/>
+              </w:rPr>
+              <w:t xml:space="preserve">TEXT</w:t>
+            </w:r>
+          </w:p>
+        </w:tc>
+        <w:tc>
+          <w:tcPr>
+            <w:tcBorders>
+              <w:top w:val="single" w:color="CCCCCC" w:sz="1"/>
+              <w:left w:val="single" w:color="CCCCCC" w:sz="1"/>
+              <w:bottom w:val="single" w:color="CCCCCC" w:sz="1"/>
+              <w:right w:val="single" w:color="CCCCCC" w:sz="1"/>
+            </w:tcBorders>
+            <w:shd w:fill="EFF4F9" w:val="clear"/>
+            <w:tcMar>
+              <w:top w:type="dxa" w:w="60"/>
+              <w:left w:type="dxa" w:w="90"/>
+              <w:bottom w:type="dxa" w:w="60"/>
+              <w:right w:type="dxa" w:w="90"/>
+            </w:tcMar>
+          </w:tcPr>
+          <w:p>
+            <w:pPr>
+              <w:jc w:val="left"/>
+            </w:pPr>
+            <w:r>
+              <w:rPr>
+                <w:rFonts w:ascii="Arial" w:cs="Arial" w:eastAsia="Arial" w:hAnsi="Arial"/>
+                <w:b w:val="false"/>
+                <w:bCs w:val="false"/>
+                <w:color w:val="1C1C1E"/>
+                <w:sz w:val="18"/>
+                <w:szCs w:val="18"/>
+              </w:rPr>
+              <w:t xml:space="preserve">NULLABLE</w:t>
+            </w:r>
+          </w:p>
+        </w:tc>
+        <w:tc>
+          <w:tcPr>
+            <w:tcBorders>
+              <w:top w:val="single" w:color="CCCCCC" w:sz="1"/>
+              <w:left w:val="single" w:color="CCCCCC" w:sz="1"/>
+              <w:bottom w:val="single" w:color="CCCCCC" w:sz="1"/>
+              <w:right w:val="single" w:color="CCCCCC" w:sz="1"/>
+            </w:tcBorders>
+            <w:shd w:fill="EFF4F9" w:val="clear"/>
+            <w:tcMar>
+              <w:top w:type="dxa" w:w="60"/>
+              <w:left w:type="dxa" w:w="90"/>
+              <w:bottom w:type="dxa" w:w="60"/>
+              <w:right w:type="dxa" w:w="90"/>
+            </w:tcMar>
+          </w:tcPr>
+          <w:p>
+            <w:pPr>
+              <w:jc w:val="left"/>
+            </w:pPr>
+            <w:r>
+              <w:rPr>
+                <w:rFonts w:ascii="Arial" w:cs="Arial" w:eastAsia="Arial" w:hAnsi="Arial"/>
+                <w:b w:val="false"/>
+                <w:bCs w:val="false"/>
+                <w:color w:val="1C1C1E"/>
+                <w:sz w:val="18"/>
+                <w:szCs w:val="18"/>
+              </w:rPr>
+              <w:t xml:space="preserve">Internal notes + why_good_fit from Claude</w:t>
+            </w:r>
+          </w:p>
+        </w:tc>
+      </w:tr>
+      <w:tr>
+        <w:tc>
+          <w:tcPr>
+            <w:tcBorders>
+              <w:top w:val="single" w:color="CCCCCC" w:sz="1"/>
+              <w:left w:val="single" w:color="CCCCCC" w:sz="1"/>
+              <w:bottom w:val="single" w:color="CCCCCC" w:sz="1"/>
+              <w:right w:val="single" w:color="CCCCCC" w:sz="1"/>
+            </w:tcBorders>
+            <w:shd w:fill="FFFFFF" w:val="clear"/>
+            <w:tcMar>
+              <w:top w:type="dxa" w:w="60"/>
+              <w:left w:type="dxa" w:w="90"/>
+              <w:bottom w:type="dxa" w:w="60"/>
+              <w:right w:type="dxa" w:w="90"/>
+            </w:tcMar>
+          </w:tcPr>
+          <w:p>
+            <w:pPr>
+              <w:jc w:val="left"/>
+            </w:pPr>
+            <w:r>
+              <w:rPr>
+                <w:rFonts w:ascii="Arial" w:cs="Arial" w:eastAsia="Arial" w:hAnsi="Arial"/>
+                <w:b/>
+                <w:bCs/>
+                <w:color w:val="1A3557"/>
+                <w:sz w:val="18"/>
+                <w:szCs w:val="18"/>
+              </w:rPr>
+              <w:t xml:space="preserve">last_contact_at</w:t>
+            </w:r>
+          </w:p>
+        </w:tc>
+        <w:tc>
+          <w:tcPr>
+            <w:tcBorders>
+              <w:top w:val="single" w:color="CCCCCC" w:sz="1"/>
+              <w:left w:val="single" w:color="CCCCCC" w:sz="1"/>
+              <w:bottom w:val="single" w:color="CCCCCC" w:sz="1"/>
+              <w:right w:val="single" w:color="CCCCCC" w:sz="1"/>
+            </w:tcBorders>
+            <w:shd w:fill="FFFFFF" w:val="clear"/>
+            <w:tcMar>
+              <w:top w:type="dxa" w:w="60"/>
+              <w:left w:type="dxa" w:w="90"/>
+              <w:bottom w:type="dxa" w:w="60"/>
+              <w:right w:type="dxa" w:w="90"/>
+            </w:tcMar>
+          </w:tcPr>
+          <w:p>
+            <w:pPr>
+              <w:jc w:val="left"/>
+            </w:pPr>
+            <w:r>
+              <w:rPr>
+                <w:rFonts w:ascii="Arial" w:cs="Arial" w:eastAsia="Arial" w:hAnsi="Arial"/>
+                <w:b w:val="false"/>
+                <w:bCs w:val="false"/>
+                <w:color w:val="1C1C1E"/>
+                <w:sz w:val="18"/>
+                <w:szCs w:val="18"/>
+              </w:rPr>
+              <w:t xml:space="preserve">DATETIME</w:t>
+            </w:r>
+          </w:p>
+        </w:tc>
+        <w:tc>
+          <w:tcPr>
+            <w:tcBorders>
+              <w:top w:val="single" w:color="CCCCCC" w:sz="1"/>
+              <w:left w:val="single" w:color="CCCCCC" w:sz="1"/>
+              <w:bottom w:val="single" w:color="CCCCCC" w:sz="1"/>
+              <w:right w:val="single" w:color="CCCCCC" w:sz="1"/>
+            </w:tcBorders>
+            <w:shd w:fill="FFFFFF" w:val="clear"/>
+            <w:tcMar>
+              <w:top w:type="dxa" w:w="60"/>
+              <w:left w:type="dxa" w:w="90"/>
+              <w:bottom w:type="dxa" w:w="60"/>
+              <w:right w:type="dxa" w:w="90"/>
+            </w:tcMar>
+          </w:tcPr>
+          <w:p>
+            <w:pPr>
+              <w:jc w:val="left"/>
+            </w:pPr>
+            <w:r>
+              <w:rPr>
+                <w:rFonts w:ascii="Arial" w:cs="Arial" w:eastAsia="Arial" w:hAnsi="Arial"/>
+                <w:b w:val="false"/>
+                <w:bCs w:val="false"/>
+                <w:color w:val="1C1C1E"/>
+                <w:sz w:val="18"/>
+                <w:szCs w:val="18"/>
+              </w:rPr>
+              <w:t xml:space="preserve">NULLABLE</w:t>
+            </w:r>
+          </w:p>
+        </w:tc>
+        <w:tc>
+          <w:tcPr>
+            <w:tcBorders>
+              <w:top w:val="single" w:color="CCCCCC" w:sz="1"/>
+              <w:left w:val="single" w:color="CCCCCC" w:sz="1"/>
+              <w:bottom w:val="single" w:color="CCCCCC" w:sz="1"/>
+              <w:right w:val="single" w:color="CCCCCC" w:sz="1"/>
+            </w:tcBorders>
+            <w:shd w:fill="FFFFFF" w:val="clear"/>
+            <w:tcMar>
+              <w:top w:type="dxa" w:w="60"/>
+              <w:left w:type="dxa" w:w="90"/>
+              <w:bottom w:type="dxa" w:w="60"/>
+              <w:right w:type="dxa" w:w="90"/>
+            </w:tcMar>
+          </w:tcPr>
+          <w:p>
+            <w:pPr>
+              <w:jc w:val="left"/>
+            </w:pPr>
+            <w:r>
+              <w:rPr>
+                <w:rFonts w:ascii="Arial" w:cs="Arial" w:eastAsia="Arial" w:hAnsi="Arial"/>
+                <w:b w:val="false"/>
+                <w:bCs w:val="false"/>
+                <w:color w:val="1C1C1E"/>
+                <w:sz w:val="18"/>
+                <w:szCs w:val="18"/>
+              </w:rPr>
+              <w:t xml:space="preserve">UTC</w:t>
+            </w:r>
+          </w:p>
+        </w:tc>
+      </w:tr>
+      <w:tr>
+        <w:tc>
+          <w:tcPr>
+            <w:tcBorders>
+              <w:top w:val="single" w:color="CCCCCC" w:sz="1"/>
+              <w:left w:val="single" w:color="CCCCCC" w:sz="1"/>
+              <w:bottom w:val="single" w:color="CCCCCC" w:sz="1"/>
+              <w:right w:val="single" w:color="CCCCCC" w:sz="1"/>
+            </w:tcBorders>
+            <w:shd w:fill="EFF4F9" w:val="clear"/>
+            <w:tcMar>
+              <w:top w:type="dxa" w:w="60"/>
+              <w:left w:type="dxa" w:w="90"/>
+              <w:bottom w:type="dxa" w:w="60"/>
+              <w:right w:type="dxa" w:w="90"/>
+            </w:tcMar>
+          </w:tcPr>
+          <w:p>
+            <w:pPr>
+              <w:jc w:val="left"/>
+            </w:pPr>
+            <w:r>
+              <w:rPr>
+                <w:rFonts w:ascii="Arial" w:cs="Arial" w:eastAsia="Arial" w:hAnsi="Arial"/>
+                <w:b/>
+                <w:bCs/>
+                <w:color w:val="1A3557"/>
+                <w:sz w:val="18"/>
+                <w:szCs w:val="18"/>
+              </w:rPr>
               <w:t xml:space="preserve">next_followup_at</w:t>
             </w:r>
           </w:p>
@@ -19813,7 +21440,7 @@
                 <w:sz w:val="18"/>
                 <w:szCs w:val="18"/>
               </w:rPr>
-              <w:t xml:space="preserve">UTC — agent-scheduled next touch</w:t>
+              <w:t xml:space="preserve">UTC</w:t>
             </w:r>
           </w:p>
         </w:tc>
@@ -20089,7 +21716,7 @@
     </w:tbl>
     <w:p>
       <w:pPr>
-        <w:spacing w:after="0" w:before="60"/>
+        <w:spacing w:after="0" w:before="40"/>
       </w:pPr>
     </w:p>
     <w:tbl>
@@ -20612,40 +22239,40 @@
                 <w:sz w:val="18"/>
                 <w:szCs w:val="18"/>
               </w:rPr>
-              <w:t xml:space="preserve">FK agent_runs NOT NULL</w:t>
-            </w:r>
-          </w:p>
-        </w:tc>
-        <w:tc>
-          <w:tcPr>
-            <w:tcBorders>
-              <w:top w:val="single" w:color="CCCCCC" w:sz="1"/>
-              <w:left w:val="single" w:color="CCCCCC" w:sz="1"/>
-              <w:bottom w:val="single" w:color="CCCCCC" w:sz="1"/>
-              <w:right w:val="single" w:color="CCCCCC" w:sz="1"/>
-            </w:tcBorders>
-            <w:shd w:fill="FFFFFF" w:val="clear"/>
-            <w:tcMar>
-              <w:top w:type="dxa" w:w="60"/>
-              <w:left w:type="dxa" w:w="90"/>
-              <w:bottom w:type="dxa" w:w="60"/>
-              <w:right w:type="dxa" w:w="90"/>
-            </w:tcMar>
-          </w:tcPr>
-          <w:p>
-            <w:pPr>
-              <w:jc w:val="left"/>
-            </w:pPr>
-            <w:r>
-              <w:rPr>
-                <w:rFonts w:ascii="Arial" w:cs="Arial" w:eastAsia="Arial" w:hAnsi="Arial"/>
-                <w:b w:val="false"/>
-                <w:bCs w:val="false"/>
-                <w:color w:val="1C1C1E"/>
-                <w:sz w:val="18"/>
-                <w:szCs w:val="18"/>
-              </w:rPr>
-              <w:t xml:space="preserve"/>
+              <w:t xml:space="preserve">FK agent_runs NULLABLE</w:t>
+            </w:r>
+          </w:p>
+        </w:tc>
+        <w:tc>
+          <w:tcPr>
+            <w:tcBorders>
+              <w:top w:val="single" w:color="CCCCCC" w:sz="1"/>
+              <w:left w:val="single" w:color="CCCCCC" w:sz="1"/>
+              <w:bottom w:val="single" w:color="CCCCCC" w:sz="1"/>
+              <w:right w:val="single" w:color="CCCCCC" w:sz="1"/>
+            </w:tcBorders>
+            <w:shd w:fill="FFFFFF" w:val="clear"/>
+            <w:tcMar>
+              <w:top w:type="dxa" w:w="60"/>
+              <w:left w:type="dxa" w:w="90"/>
+              <w:bottom w:type="dxa" w:w="60"/>
+              <w:right w:type="dxa" w:w="90"/>
+            </w:tcMar>
+          </w:tcPr>
+          <w:p>
+            <w:pPr>
+              <w:jc w:val="left"/>
+            </w:pPr>
+            <w:r>
+              <w:rPr>
+                <w:rFonts w:ascii="Arial" w:cs="Arial" w:eastAsia="Arial" w:hAnsi="Arial"/>
+                <w:b w:val="false"/>
+                <w:bCs w:val="false"/>
+                <w:color w:val="1C1C1E"/>
+                <w:sz w:val="18"/>
+                <w:szCs w:val="18"/>
+              </w:rPr>
+              <w:t xml:space="preserve">NULL for manually created outreach</w:t>
             </w:r>
           </w:p>
         </w:tc>
@@ -21589,6 +23216,925 @@
         </w:tc>
       </w:tr>
     </w:tbl>
+    <w:p>
+      <w:pPr>
+        <w:spacing w:after="0" w:before="60"/>
+      </w:pPr>
+    </w:p>
+    <w:p>
+      <w:pPr>
+        <w:pStyle w:val="Heading2"/>
+        <w:spacing w:after="120" w:before="280"/>
+      </w:pPr>
+      <w:r>
+        <w:rPr>
+          <w:rFonts w:ascii="Arial" w:cs="Arial" w:eastAsia="Arial" w:hAnsi="Arial"/>
+          <w:b/>
+          <w:bCs/>
+          <w:color w:val="2E7D8C"/>
+          <w:sz w:val="28"/>
+          <w:szCs w:val="28"/>
+        </w:rPr>
+        <w:t xml:space="preserve">4.9 New &amp; Modified Routes — Partnership Agent</w:t>
+      </w:r>
+    </w:p>
+    <w:tbl>
+      <w:tblPr>
+        <w:tblW w:type="dxa" w:w="9360"/>
+        <w:tblBorders>
+          <w:top w:val="single" w:color="auto" w:sz="4"/>
+          <w:left w:val="single" w:color="auto" w:sz="4"/>
+          <w:bottom w:val="single" w:color="auto" w:sz="4"/>
+          <w:right w:val="single" w:color="auto" w:sz="4"/>
+          <w:insideH w:val="single" w:color="auto" w:sz="4"/>
+          <w:insideV w:val="single" w:color="auto" w:sz="4"/>
+        </w:tblBorders>
+      </w:tblPr>
+      <w:tblGrid>
+        <w:gridCol w:w="1200"/>
+        <w:gridCol w:w="3800"/>
+        <w:gridCol w:w="4360"/>
+      </w:tblGrid>
+      <w:tr>
+        <w:tc>
+          <w:tcPr>
+            <w:tcBorders>
+              <w:top w:val="single" w:color="CCCCCC" w:sz="1"/>
+              <w:left w:val="single" w:color="CCCCCC" w:sz="1"/>
+              <w:bottom w:val="single" w:color="CCCCCC" w:sz="1"/>
+              <w:right w:val="single" w:color="CCCCCC" w:sz="1"/>
+            </w:tcBorders>
+            <w:shd w:fill="1A3557" w:val="clear"/>
+            <w:tcMar>
+              <w:top w:type="dxa" w:w="80"/>
+              <w:left w:type="dxa" w:w="120"/>
+              <w:bottom w:type="dxa" w:w="80"/>
+              <w:right w:type="dxa" w:w="120"/>
+            </w:tcMar>
+            <w:vAlign w:val="center"/>
+          </w:tcPr>
+          <w:p>
+            <w:pPr>
+              <w:jc w:val="center"/>
+            </w:pPr>
+            <w:r>
+              <w:rPr>
+                <w:rFonts w:ascii="Arial" w:cs="Arial" w:eastAsia="Arial" w:hAnsi="Arial"/>
+                <w:b/>
+                <w:bCs/>
+                <w:color w:val="FFFFFF"/>
+                <w:sz w:val="20"/>
+                <w:szCs w:val="20"/>
+              </w:rPr>
+              <w:t xml:space="preserve">Method</w:t>
+            </w:r>
+          </w:p>
+        </w:tc>
+        <w:tc>
+          <w:tcPr>
+            <w:tcBorders>
+              <w:top w:val="single" w:color="CCCCCC" w:sz="1"/>
+              <w:left w:val="single" w:color="CCCCCC" w:sz="1"/>
+              <w:bottom w:val="single" w:color="CCCCCC" w:sz="1"/>
+              <w:right w:val="single" w:color="CCCCCC" w:sz="1"/>
+            </w:tcBorders>
+            <w:shd w:fill="1A3557" w:val="clear"/>
+            <w:tcMar>
+              <w:top w:type="dxa" w:w="80"/>
+              <w:left w:type="dxa" w:w="120"/>
+              <w:bottom w:type="dxa" w:w="80"/>
+              <w:right w:type="dxa" w:w="120"/>
+            </w:tcMar>
+            <w:vAlign w:val="center"/>
+          </w:tcPr>
+          <w:p>
+            <w:pPr>
+              <w:jc w:val="center"/>
+            </w:pPr>
+            <w:r>
+              <w:rPr>
+                <w:rFonts w:ascii="Arial" w:cs="Arial" w:eastAsia="Arial" w:hAnsi="Arial"/>
+                <w:b/>
+                <w:bCs/>
+                <w:color w:val="FFFFFF"/>
+                <w:sz w:val="20"/>
+                <w:szCs w:val="20"/>
+              </w:rPr>
+              <w:t xml:space="preserve">Route</w:t>
+            </w:r>
+          </w:p>
+        </w:tc>
+        <w:tc>
+          <w:tcPr>
+            <w:tcBorders>
+              <w:top w:val="single" w:color="CCCCCC" w:sz="1"/>
+              <w:left w:val="single" w:color="CCCCCC" w:sz="1"/>
+              <w:bottom w:val="single" w:color="CCCCCC" w:sz="1"/>
+              <w:right w:val="single" w:color="CCCCCC" w:sz="1"/>
+            </w:tcBorders>
+            <w:shd w:fill="1A3557" w:val="clear"/>
+            <w:tcMar>
+              <w:top w:type="dxa" w:w="80"/>
+              <w:left w:type="dxa" w:w="120"/>
+              <w:bottom w:type="dxa" w:w="80"/>
+              <w:right w:type="dxa" w:w="120"/>
+            </w:tcMar>
+            <w:vAlign w:val="center"/>
+          </w:tcPr>
+          <w:p>
+            <w:pPr>
+              <w:jc w:val="center"/>
+            </w:pPr>
+            <w:r>
+              <w:rPr>
+                <w:rFonts w:ascii="Arial" w:cs="Arial" w:eastAsia="Arial" w:hAnsi="Arial"/>
+                <w:b/>
+                <w:bCs/>
+                <w:color w:val="FFFFFF"/>
+                <w:sz w:val="20"/>
+                <w:szCs w:val="20"/>
+              </w:rPr>
+              <w:t xml:space="preserve">Description</w:t>
+            </w:r>
+          </w:p>
+        </w:tc>
+      </w:tr>
+      <w:tr>
+        <w:tc>
+          <w:tcPr>
+            <w:tcBorders>
+              <w:top w:val="single" w:color="CCCCCC" w:sz="1"/>
+              <w:left w:val="single" w:color="CCCCCC" w:sz="1"/>
+              <w:bottom w:val="single" w:color="CCCCCC" w:sz="1"/>
+              <w:right w:val="single" w:color="CCCCCC" w:sz="1"/>
+            </w:tcBorders>
+            <w:shd w:fill="FFFFFF" w:val="clear"/>
+            <w:tcMar>
+              <w:top w:type="dxa" w:w="60"/>
+              <w:left w:type="dxa" w:w="90"/>
+              <w:bottom w:type="dxa" w:w="60"/>
+              <w:right w:type="dxa" w:w="90"/>
+            </w:tcMar>
+          </w:tcPr>
+          <w:p>
+            <w:pPr>
+              <w:jc w:val="left"/>
+            </w:pPr>
+            <w:r>
+              <w:rPr>
+                <w:rFonts w:ascii="Arial" w:cs="Arial" w:eastAsia="Arial" w:hAnsi="Arial"/>
+                <w:b/>
+                <w:bCs/>
+                <w:color w:val="1A3557"/>
+                <w:sz w:val="18"/>
+                <w:szCs w:val="18"/>
+              </w:rPr>
+              <w:t xml:space="preserve">GET</w:t>
+            </w:r>
+          </w:p>
+        </w:tc>
+        <w:tc>
+          <w:tcPr>
+            <w:tcBorders>
+              <w:top w:val="single" w:color="CCCCCC" w:sz="1"/>
+              <w:left w:val="single" w:color="CCCCCC" w:sz="1"/>
+              <w:bottom w:val="single" w:color="CCCCCC" w:sz="1"/>
+              <w:right w:val="single" w:color="CCCCCC" w:sz="1"/>
+            </w:tcBorders>
+            <w:shd w:fill="FFFFFF" w:val="clear"/>
+            <w:tcMar>
+              <w:top w:type="dxa" w:w="60"/>
+              <w:left w:type="dxa" w:w="90"/>
+              <w:bottom w:type="dxa" w:w="60"/>
+              <w:right w:type="dxa" w:w="90"/>
+            </w:tcMar>
+          </w:tcPr>
+          <w:p>
+            <w:pPr>
+              <w:jc w:val="left"/>
+            </w:pPr>
+            <w:r>
+              <w:rPr>
+                <w:rFonts w:ascii="Courier New" w:cs="Courier New" w:eastAsia="Courier New" w:hAnsi="Courier New"/>
+                <w:b w:val="false"/>
+                <w:bCs w:val="false"/>
+                <w:color w:val="1C1C1E"/>
+                <w:sz w:val="18"/>
+                <w:szCs w:val="18"/>
+              </w:rPr>
+              <w:t xml:space="preserve">/admin/agents/partnerships</w:t>
+            </w:r>
+          </w:p>
+        </w:tc>
+        <w:tc>
+          <w:tcPr>
+            <w:tcBorders>
+              <w:top w:val="single" w:color="CCCCCC" w:sz="1"/>
+              <w:left w:val="single" w:color="CCCCCC" w:sz="1"/>
+              <w:bottom w:val="single" w:color="CCCCCC" w:sz="1"/>
+              <w:right w:val="single" w:color="CCCCCC" w:sz="1"/>
+            </w:tcBorders>
+            <w:shd w:fill="FFFFFF" w:val="clear"/>
+            <w:tcMar>
+              <w:top w:type="dxa" w:w="60"/>
+              <w:left w:type="dxa" w:w="90"/>
+              <w:bottom w:type="dxa" w:w="60"/>
+              <w:right w:type="dxa" w:w="90"/>
+            </w:tcMar>
+          </w:tcPr>
+          <w:p>
+            <w:pPr>
+              <w:jc w:val="left"/>
+            </w:pPr>
+            <w:r>
+              <w:rPr>
+                <w:rFonts w:ascii="Arial" w:cs="Arial" w:eastAsia="Arial" w:hAnsi="Arial"/>
+                <w:b w:val="false"/>
+                <w:bCs w:val="false"/>
+                <w:color w:val="1C1C1E"/>
+                <w:sz w:val="18"/>
+                <w:szCs w:val="18"/>
+              </w:rPr>
+              <w:t xml:space="preserve">Pipeline overview — all partners by status</w:t>
+            </w:r>
+          </w:p>
+        </w:tc>
+      </w:tr>
+      <w:tr>
+        <w:tc>
+          <w:tcPr>
+            <w:tcBorders>
+              <w:top w:val="single" w:color="CCCCCC" w:sz="1"/>
+              <w:left w:val="single" w:color="CCCCCC" w:sz="1"/>
+              <w:bottom w:val="single" w:color="CCCCCC" w:sz="1"/>
+              <w:right w:val="single" w:color="CCCCCC" w:sz="1"/>
+            </w:tcBorders>
+            <w:shd w:fill="EFF4F9" w:val="clear"/>
+            <w:tcMar>
+              <w:top w:type="dxa" w:w="60"/>
+              <w:left w:type="dxa" w:w="90"/>
+              <w:bottom w:type="dxa" w:w="60"/>
+              <w:right w:type="dxa" w:w="90"/>
+            </w:tcMar>
+          </w:tcPr>
+          <w:p>
+            <w:pPr>
+              <w:jc w:val="left"/>
+            </w:pPr>
+            <w:r>
+              <w:rPr>
+                <w:rFonts w:ascii="Arial" w:cs="Arial" w:eastAsia="Arial" w:hAnsi="Arial"/>
+                <w:b/>
+                <w:bCs/>
+                <w:color w:val="1A3557"/>
+                <w:sz w:val="18"/>
+                <w:szCs w:val="18"/>
+              </w:rPr>
+              <w:t xml:space="preserve">GET/POST</w:t>
+            </w:r>
+          </w:p>
+        </w:tc>
+        <w:tc>
+          <w:tcPr>
+            <w:tcBorders>
+              <w:top w:val="single" w:color="CCCCCC" w:sz="1"/>
+              <w:left w:val="single" w:color="CCCCCC" w:sz="1"/>
+              <w:bottom w:val="single" w:color="CCCCCC" w:sz="1"/>
+              <w:right w:val="single" w:color="CCCCCC" w:sz="1"/>
+            </w:tcBorders>
+            <w:shd w:fill="EFF4F9" w:val="clear"/>
+            <w:tcMar>
+              <w:top w:type="dxa" w:w="60"/>
+              <w:left w:type="dxa" w:w="90"/>
+              <w:bottom w:type="dxa" w:w="60"/>
+              <w:right w:type="dxa" w:w="90"/>
+            </w:tcMar>
+          </w:tcPr>
+          <w:p>
+            <w:pPr>
+              <w:jc w:val="left"/>
+            </w:pPr>
+            <w:r>
+              <w:rPr>
+                <w:rFonts w:ascii="Courier New" w:cs="Courier New" w:eastAsia="Courier New" w:hAnsi="Courier New"/>
+                <w:b w:val="false"/>
+                <w:bCs w:val="false"/>
+                <w:color w:val="1C1C1E"/>
+                <w:sz w:val="18"/>
+                <w:szCs w:val="18"/>
+              </w:rPr>
+              <w:t xml:space="preserve">/admin/agents/partnerships/search</w:t>
+            </w:r>
+          </w:p>
+        </w:tc>
+        <w:tc>
+          <w:tcPr>
+            <w:tcBorders>
+              <w:top w:val="single" w:color="CCCCCC" w:sz="1"/>
+              <w:left w:val="single" w:color="CCCCCC" w:sz="1"/>
+              <w:bottom w:val="single" w:color="CCCCCC" w:sz="1"/>
+              <w:right w:val="single" w:color="CCCCCC" w:sz="1"/>
+            </w:tcBorders>
+            <w:shd w:fill="EFF4F9" w:val="clear"/>
+            <w:tcMar>
+              <w:top w:type="dxa" w:w="60"/>
+              <w:left w:type="dxa" w:w="90"/>
+              <w:bottom w:type="dxa" w:w="60"/>
+              <w:right w:type="dxa" w:w="90"/>
+            </w:tcMar>
+          </w:tcPr>
+          <w:p>
+            <w:pPr>
+              <w:jc w:val="left"/>
+            </w:pPr>
+            <w:r>
+              <w:rPr>
+                <w:rFonts w:ascii="Arial" w:cs="Arial" w:eastAsia="Arial" w:hAnsi="Arial"/>
+                <w:b w:val="false"/>
+                <w:bCs w:val="false"/>
+                <w:color w:val="1C1C1E"/>
+                <w:sz w:val="18"/>
+                <w:szCs w:val="18"/>
+              </w:rPr>
+              <w:t xml:space="preserve">NEW — web search form + results display</w:t>
+            </w:r>
+          </w:p>
+        </w:tc>
+      </w:tr>
+      <w:tr>
+        <w:tc>
+          <w:tcPr>
+            <w:tcBorders>
+              <w:top w:val="single" w:color="CCCCCC" w:sz="1"/>
+              <w:left w:val="single" w:color="CCCCCC" w:sz="1"/>
+              <w:bottom w:val="single" w:color="CCCCCC" w:sz="1"/>
+              <w:right w:val="single" w:color="CCCCCC" w:sz="1"/>
+            </w:tcBorders>
+            <w:shd w:fill="FFFFFF" w:val="clear"/>
+            <w:tcMar>
+              <w:top w:type="dxa" w:w="60"/>
+              <w:left w:type="dxa" w:w="90"/>
+              <w:bottom w:type="dxa" w:w="60"/>
+              <w:right w:type="dxa" w:w="90"/>
+            </w:tcMar>
+          </w:tcPr>
+          <w:p>
+            <w:pPr>
+              <w:jc w:val="left"/>
+            </w:pPr>
+            <w:r>
+              <w:rPr>
+                <w:rFonts w:ascii="Arial" w:cs="Arial" w:eastAsia="Arial" w:hAnsi="Arial"/>
+                <w:b/>
+                <w:bCs/>
+                <w:color w:val="1A3557"/>
+                <w:sz w:val="18"/>
+                <w:szCs w:val="18"/>
+              </w:rPr>
+              <w:t xml:space="preserve">GET/POST</w:t>
+            </w:r>
+          </w:p>
+        </w:tc>
+        <w:tc>
+          <w:tcPr>
+            <w:tcBorders>
+              <w:top w:val="single" w:color="CCCCCC" w:sz="1"/>
+              <w:left w:val="single" w:color="CCCCCC" w:sz="1"/>
+              <w:bottom w:val="single" w:color="CCCCCC" w:sz="1"/>
+              <w:right w:val="single" w:color="CCCCCC" w:sz="1"/>
+            </w:tcBorders>
+            <w:shd w:fill="FFFFFF" w:val="clear"/>
+            <w:tcMar>
+              <w:top w:type="dxa" w:w="60"/>
+              <w:left w:type="dxa" w:w="90"/>
+              <w:bottom w:type="dxa" w:w="60"/>
+              <w:right w:type="dxa" w:w="90"/>
+            </w:tcMar>
+          </w:tcPr>
+          <w:p>
+            <w:pPr>
+              <w:jc w:val="left"/>
+            </w:pPr>
+            <w:r>
+              <w:rPr>
+                <w:rFonts w:ascii="Courier New" w:cs="Courier New" w:eastAsia="Courier New" w:hAnsi="Courier New"/>
+                <w:b w:val="false"/>
+                <w:bCs w:val="false"/>
+                <w:color w:val="1C1C1E"/>
+                <w:sz w:val="18"/>
+                <w:szCs w:val="18"/>
+              </w:rPr>
+              <w:t xml:space="preserve">/admin/agents/partnerships/&lt;id&gt;/edit</w:t>
+            </w:r>
+          </w:p>
+        </w:tc>
+        <w:tc>
+          <w:tcPr>
+            <w:tcBorders>
+              <w:top w:val="single" w:color="CCCCCC" w:sz="1"/>
+              <w:left w:val="single" w:color="CCCCCC" w:sz="1"/>
+              <w:bottom w:val="single" w:color="CCCCCC" w:sz="1"/>
+              <w:right w:val="single" w:color="CCCCCC" w:sz="1"/>
+            </w:tcBorders>
+            <w:shd w:fill="FFFFFF" w:val="clear"/>
+            <w:tcMar>
+              <w:top w:type="dxa" w:w="60"/>
+              <w:left w:type="dxa" w:w="90"/>
+              <w:bottom w:type="dxa" w:w="60"/>
+              <w:right w:type="dxa" w:w="90"/>
+            </w:tcMar>
+          </w:tcPr>
+          <w:p>
+            <w:pPr>
+              <w:jc w:val="left"/>
+            </w:pPr>
+            <w:r>
+              <w:rPr>
+                <w:rFonts w:ascii="Arial" w:cs="Arial" w:eastAsia="Arial" w:hAnsi="Arial"/>
+                <w:b w:val="false"/>
+                <w:bCs w:val="false"/>
+                <w:color w:val="1C1C1E"/>
+                <w:sz w:val="18"/>
+                <w:szCs w:val="18"/>
+              </w:rPr>
+              <w:t xml:space="preserve">Edit a partner CRM record</w:t>
+            </w:r>
+          </w:p>
+        </w:tc>
+      </w:tr>
+      <w:tr>
+        <w:tc>
+          <w:tcPr>
+            <w:tcBorders>
+              <w:top w:val="single" w:color="CCCCCC" w:sz="1"/>
+              <w:left w:val="single" w:color="CCCCCC" w:sz="1"/>
+              <w:bottom w:val="single" w:color="CCCCCC" w:sz="1"/>
+              <w:right w:val="single" w:color="CCCCCC" w:sz="1"/>
+            </w:tcBorders>
+            <w:shd w:fill="EFF4F9" w:val="clear"/>
+            <w:tcMar>
+              <w:top w:type="dxa" w:w="60"/>
+              <w:left w:type="dxa" w:w="90"/>
+              <w:bottom w:type="dxa" w:w="60"/>
+              <w:right w:type="dxa" w:w="90"/>
+            </w:tcMar>
+          </w:tcPr>
+          <w:p>
+            <w:pPr>
+              <w:jc w:val="left"/>
+            </w:pPr>
+            <w:r>
+              <w:rPr>
+                <w:rFonts w:ascii="Arial" w:cs="Arial" w:eastAsia="Arial" w:hAnsi="Arial"/>
+                <w:b/>
+                <w:bCs/>
+                <w:color w:val="1A3557"/>
+                <w:sz w:val="18"/>
+                <w:szCs w:val="18"/>
+              </w:rPr>
+              <w:t xml:space="preserve">POST</w:t>
+            </w:r>
+          </w:p>
+        </w:tc>
+        <w:tc>
+          <w:tcPr>
+            <w:tcBorders>
+              <w:top w:val="single" w:color="CCCCCC" w:sz="1"/>
+              <w:left w:val="single" w:color="CCCCCC" w:sz="1"/>
+              <w:bottom w:val="single" w:color="CCCCCC" w:sz="1"/>
+              <w:right w:val="single" w:color="CCCCCC" w:sz="1"/>
+            </w:tcBorders>
+            <w:shd w:fill="EFF4F9" w:val="clear"/>
+            <w:tcMar>
+              <w:top w:type="dxa" w:w="60"/>
+              <w:left w:type="dxa" w:w="90"/>
+              <w:bottom w:type="dxa" w:w="60"/>
+              <w:right w:type="dxa" w:w="90"/>
+            </w:tcMar>
+          </w:tcPr>
+          <w:p>
+            <w:pPr>
+              <w:jc w:val="left"/>
+            </w:pPr>
+            <w:r>
+              <w:rPr>
+                <w:rFonts w:ascii="Courier New" w:cs="Courier New" w:eastAsia="Courier New" w:hAnsi="Courier New"/>
+                <w:b w:val="false"/>
+                <w:bCs w:val="false"/>
+                <w:color w:val="1C1C1E"/>
+                <w:sz w:val="18"/>
+                <w:szCs w:val="18"/>
+              </w:rPr>
+              <w:t xml:space="preserve">/admin/agents/partnerships/&lt;id&gt;/delete</w:t>
+            </w:r>
+          </w:p>
+        </w:tc>
+        <w:tc>
+          <w:tcPr>
+            <w:tcBorders>
+              <w:top w:val="single" w:color="CCCCCC" w:sz="1"/>
+              <w:left w:val="single" w:color="CCCCCC" w:sz="1"/>
+              <w:bottom w:val="single" w:color="CCCCCC" w:sz="1"/>
+              <w:right w:val="single" w:color="CCCCCC" w:sz="1"/>
+            </w:tcBorders>
+            <w:shd w:fill="EFF4F9" w:val="clear"/>
+            <w:tcMar>
+              <w:top w:type="dxa" w:w="60"/>
+              <w:left w:type="dxa" w:w="90"/>
+              <w:bottom w:type="dxa" w:w="60"/>
+              <w:right w:type="dxa" w:w="90"/>
+            </w:tcMar>
+          </w:tcPr>
+          <w:p>
+            <w:pPr>
+              <w:jc w:val="left"/>
+            </w:pPr>
+            <w:r>
+              <w:rPr>
+                <w:rFonts w:ascii="Arial" w:cs="Arial" w:eastAsia="Arial" w:hAnsi="Arial"/>
+                <w:b w:val="false"/>
+                <w:bCs w:val="false"/>
+                <w:color w:val="1C1C1E"/>
+                <w:sz w:val="18"/>
+                <w:szCs w:val="18"/>
+              </w:rPr>
+              <w:t xml:space="preserve">Remove a partner record (prospect only)</w:t>
+            </w:r>
+          </w:p>
+        </w:tc>
+      </w:tr>
+      <w:tr>
+        <w:tc>
+          <w:tcPr>
+            <w:tcBorders>
+              <w:top w:val="single" w:color="CCCCCC" w:sz="1"/>
+              <w:left w:val="single" w:color="CCCCCC" w:sz="1"/>
+              <w:bottom w:val="single" w:color="CCCCCC" w:sz="1"/>
+              <w:right w:val="single" w:color="CCCCCC" w:sz="1"/>
+            </w:tcBorders>
+            <w:shd w:fill="FFFFFF" w:val="clear"/>
+            <w:tcMar>
+              <w:top w:type="dxa" w:w="60"/>
+              <w:left w:type="dxa" w:w="90"/>
+              <w:bottom w:type="dxa" w:w="60"/>
+              <w:right w:type="dxa" w:w="90"/>
+            </w:tcMar>
+          </w:tcPr>
+          <w:p>
+            <w:pPr>
+              <w:jc w:val="left"/>
+            </w:pPr>
+            <w:r>
+              <w:rPr>
+                <w:rFonts w:ascii="Arial" w:cs="Arial" w:eastAsia="Arial" w:hAnsi="Arial"/>
+                <w:b/>
+                <w:bCs/>
+                <w:color w:val="1A3557"/>
+                <w:sz w:val="18"/>
+                <w:szCs w:val="18"/>
+              </w:rPr>
+              <w:t xml:space="preserve">GET</w:t>
+            </w:r>
+          </w:p>
+        </w:tc>
+        <w:tc>
+          <w:tcPr>
+            <w:tcBorders>
+              <w:top w:val="single" w:color="CCCCCC" w:sz="1"/>
+              <w:left w:val="single" w:color="CCCCCC" w:sz="1"/>
+              <w:bottom w:val="single" w:color="CCCCCC" w:sz="1"/>
+              <w:right w:val="single" w:color="CCCCCC" w:sz="1"/>
+            </w:tcBorders>
+            <w:shd w:fill="FFFFFF" w:val="clear"/>
+            <w:tcMar>
+              <w:top w:type="dxa" w:w="60"/>
+              <w:left w:type="dxa" w:w="90"/>
+              <w:bottom w:type="dxa" w:w="60"/>
+              <w:right w:type="dxa" w:w="90"/>
+            </w:tcMar>
+          </w:tcPr>
+          <w:p>
+            <w:pPr>
+              <w:jc w:val="left"/>
+            </w:pPr>
+            <w:r>
+              <w:rPr>
+                <w:rFonts w:ascii="Courier New" w:cs="Courier New" w:eastAsia="Courier New" w:hAnsi="Courier New"/>
+                <w:b w:val="false"/>
+                <w:bCs w:val="false"/>
+                <w:color w:val="1C1C1E"/>
+                <w:sz w:val="18"/>
+                <w:szCs w:val="18"/>
+              </w:rPr>
+              <w:t xml:space="preserve">/admin/agents/partnerships/&lt;id&gt;/outreach</w:t>
+            </w:r>
+          </w:p>
+        </w:tc>
+        <w:tc>
+          <w:tcPr>
+            <w:tcBorders>
+              <w:top w:val="single" w:color="CCCCCC" w:sz="1"/>
+              <w:left w:val="single" w:color="CCCCCC" w:sz="1"/>
+              <w:bottom w:val="single" w:color="CCCCCC" w:sz="1"/>
+              <w:right w:val="single" w:color="CCCCCC" w:sz="1"/>
+            </w:tcBorders>
+            <w:shd w:fill="FFFFFF" w:val="clear"/>
+            <w:tcMar>
+              <w:top w:type="dxa" w:w="60"/>
+              <w:left w:type="dxa" w:w="90"/>
+              <w:bottom w:type="dxa" w:w="60"/>
+              <w:right w:type="dxa" w:w="90"/>
+            </w:tcMar>
+          </w:tcPr>
+          <w:p>
+            <w:pPr>
+              <w:jc w:val="left"/>
+            </w:pPr>
+            <w:r>
+              <w:rPr>
+                <w:rFonts w:ascii="Arial" w:cs="Arial" w:eastAsia="Arial" w:hAnsi="Arial"/>
+                <w:b w:val="false"/>
+                <w:bCs w:val="false"/>
+                <w:color w:val="1C1C1E"/>
+                <w:sz w:val="18"/>
+                <w:szCs w:val="18"/>
+              </w:rPr>
+              <w:t xml:space="preserve">Outreach history for one partner</w:t>
+            </w:r>
+          </w:p>
+        </w:tc>
+      </w:tr>
+      <w:tr>
+        <w:tc>
+          <w:tcPr>
+            <w:tcBorders>
+              <w:top w:val="single" w:color="CCCCCC" w:sz="1"/>
+              <w:left w:val="single" w:color="CCCCCC" w:sz="1"/>
+              <w:bottom w:val="single" w:color="CCCCCC" w:sz="1"/>
+              <w:right w:val="single" w:color="CCCCCC" w:sz="1"/>
+            </w:tcBorders>
+            <w:shd w:fill="EFF4F9" w:val="clear"/>
+            <w:tcMar>
+              <w:top w:type="dxa" w:w="60"/>
+              <w:left w:type="dxa" w:w="90"/>
+              <w:bottom w:type="dxa" w:w="60"/>
+              <w:right w:type="dxa" w:w="90"/>
+            </w:tcMar>
+          </w:tcPr>
+          <w:p>
+            <w:pPr>
+              <w:jc w:val="left"/>
+            </w:pPr>
+            <w:r>
+              <w:rPr>
+                <w:rFonts w:ascii="Arial" w:cs="Arial" w:eastAsia="Arial" w:hAnsi="Arial"/>
+                <w:b/>
+                <w:bCs/>
+                <w:color w:val="1A3557"/>
+                <w:sz w:val="18"/>
+                <w:szCs w:val="18"/>
+              </w:rPr>
+              <w:t xml:space="preserve">POST</w:t>
+            </w:r>
+          </w:p>
+        </w:tc>
+        <w:tc>
+          <w:tcPr>
+            <w:tcBorders>
+              <w:top w:val="single" w:color="CCCCCC" w:sz="1"/>
+              <w:left w:val="single" w:color="CCCCCC" w:sz="1"/>
+              <w:bottom w:val="single" w:color="CCCCCC" w:sz="1"/>
+              <w:right w:val="single" w:color="CCCCCC" w:sz="1"/>
+            </w:tcBorders>
+            <w:shd w:fill="EFF4F9" w:val="clear"/>
+            <w:tcMar>
+              <w:top w:type="dxa" w:w="60"/>
+              <w:left w:type="dxa" w:w="90"/>
+              <w:bottom w:type="dxa" w:w="60"/>
+              <w:right w:type="dxa" w:w="90"/>
+            </w:tcMar>
+          </w:tcPr>
+          <w:p>
+            <w:pPr>
+              <w:jc w:val="left"/>
+            </w:pPr>
+            <w:r>
+              <w:rPr>
+                <w:rFonts w:ascii="Courier New" w:cs="Courier New" w:eastAsia="Courier New" w:hAnsi="Courier New"/>
+                <w:b w:val="false"/>
+                <w:bCs w:val="false"/>
+                <w:color w:val="1C1C1E"/>
+                <w:sz w:val="18"/>
+                <w:szCs w:val="18"/>
+              </w:rPr>
+              <w:t xml:space="preserve">/admin/agents/partnerships/outreach/approve/&lt;id&gt;</w:t>
+            </w:r>
+          </w:p>
+        </w:tc>
+        <w:tc>
+          <w:tcPr>
+            <w:tcBorders>
+              <w:top w:val="single" w:color="CCCCCC" w:sz="1"/>
+              <w:left w:val="single" w:color="CCCCCC" w:sz="1"/>
+              <w:bottom w:val="single" w:color="CCCCCC" w:sz="1"/>
+              <w:right w:val="single" w:color="CCCCCC" w:sz="1"/>
+            </w:tcBorders>
+            <w:shd w:fill="EFF4F9" w:val="clear"/>
+            <w:tcMar>
+              <w:top w:type="dxa" w:w="60"/>
+              <w:left w:type="dxa" w:w="90"/>
+              <w:bottom w:type="dxa" w:w="60"/>
+              <w:right w:type="dxa" w:w="90"/>
+            </w:tcMar>
+          </w:tcPr>
+          <w:p>
+            <w:pPr>
+              <w:jc w:val="left"/>
+            </w:pPr>
+            <w:r>
+              <w:rPr>
+                <w:rFonts w:ascii="Arial" w:cs="Arial" w:eastAsia="Arial" w:hAnsi="Arial"/>
+                <w:b w:val="false"/>
+                <w:bCs w:val="false"/>
+                <w:color w:val="1C1C1E"/>
+                <w:sz w:val="18"/>
+                <w:szCs w:val="18"/>
+              </w:rPr>
+              <w:t xml:space="preserve">Approve a drafted outreach email</w:t>
+            </w:r>
+          </w:p>
+        </w:tc>
+      </w:tr>
+      <w:tr>
+        <w:tc>
+          <w:tcPr>
+            <w:tcBorders>
+              <w:top w:val="single" w:color="CCCCCC" w:sz="1"/>
+              <w:left w:val="single" w:color="CCCCCC" w:sz="1"/>
+              <w:bottom w:val="single" w:color="CCCCCC" w:sz="1"/>
+              <w:right w:val="single" w:color="CCCCCC" w:sz="1"/>
+            </w:tcBorders>
+            <w:shd w:fill="FFFFFF" w:val="clear"/>
+            <w:tcMar>
+              <w:top w:type="dxa" w:w="60"/>
+              <w:left w:type="dxa" w:w="90"/>
+              <w:bottom w:type="dxa" w:w="60"/>
+              <w:right w:type="dxa" w:w="90"/>
+            </w:tcMar>
+          </w:tcPr>
+          <w:p>
+            <w:pPr>
+              <w:jc w:val="left"/>
+            </w:pPr>
+            <w:r>
+              <w:rPr>
+                <w:rFonts w:ascii="Arial" w:cs="Arial" w:eastAsia="Arial" w:hAnsi="Arial"/>
+                <w:b/>
+                <w:bCs/>
+                <w:color w:val="1A3557"/>
+                <w:sz w:val="18"/>
+                <w:szCs w:val="18"/>
+              </w:rPr>
+              <w:t xml:space="preserve">POST</w:t>
+            </w:r>
+          </w:p>
+        </w:tc>
+        <w:tc>
+          <w:tcPr>
+            <w:tcBorders>
+              <w:top w:val="single" w:color="CCCCCC" w:sz="1"/>
+              <w:left w:val="single" w:color="CCCCCC" w:sz="1"/>
+              <w:bottom w:val="single" w:color="CCCCCC" w:sz="1"/>
+              <w:right w:val="single" w:color="CCCCCC" w:sz="1"/>
+            </w:tcBorders>
+            <w:shd w:fill="FFFFFF" w:val="clear"/>
+            <w:tcMar>
+              <w:top w:type="dxa" w:w="60"/>
+              <w:left w:type="dxa" w:w="90"/>
+              <w:bottom w:type="dxa" w:w="60"/>
+              <w:right w:type="dxa" w:w="90"/>
+            </w:tcMar>
+          </w:tcPr>
+          <w:p>
+            <w:pPr>
+              <w:jc w:val="left"/>
+            </w:pPr>
+            <w:r>
+              <w:rPr>
+                <w:rFonts w:ascii="Courier New" w:cs="Courier New" w:eastAsia="Courier New" w:hAnsi="Courier New"/>
+                <w:b w:val="false"/>
+                <w:bCs w:val="false"/>
+                <w:color w:val="1C1C1E"/>
+                <w:sz w:val="18"/>
+                <w:szCs w:val="18"/>
+              </w:rPr>
+              <w:t xml:space="preserve">/admin/agents/partnerships/outreach/reject/&lt;id&gt;</w:t>
+            </w:r>
+          </w:p>
+        </w:tc>
+        <w:tc>
+          <w:tcPr>
+            <w:tcBorders>
+              <w:top w:val="single" w:color="CCCCCC" w:sz="1"/>
+              <w:left w:val="single" w:color="CCCCCC" w:sz="1"/>
+              <w:bottom w:val="single" w:color="CCCCCC" w:sz="1"/>
+              <w:right w:val="single" w:color="CCCCCC" w:sz="1"/>
+            </w:tcBorders>
+            <w:shd w:fill="FFFFFF" w:val="clear"/>
+            <w:tcMar>
+              <w:top w:type="dxa" w:w="60"/>
+              <w:left w:type="dxa" w:w="90"/>
+              <w:bottom w:type="dxa" w:w="60"/>
+              <w:right w:type="dxa" w:w="90"/>
+            </w:tcMar>
+          </w:tcPr>
+          <w:p>
+            <w:pPr>
+              <w:jc w:val="left"/>
+            </w:pPr>
+            <w:r>
+              <w:rPr>
+                <w:rFonts w:ascii="Arial" w:cs="Arial" w:eastAsia="Arial" w:hAnsi="Arial"/>
+                <w:b w:val="false"/>
+                <w:bCs w:val="false"/>
+                <w:color w:val="1C1C1E"/>
+                <w:sz w:val="18"/>
+                <w:szCs w:val="18"/>
+              </w:rPr>
+              <w:t xml:space="preserve">Reject a drafted outreach email</w:t>
+            </w:r>
+          </w:p>
+        </w:tc>
+      </w:tr>
+    </w:tbl>
+    <w:p>
+      <w:pPr>
+        <w:spacing w:after="0" w:before="60"/>
+      </w:pPr>
+    </w:p>
+    <w:p>
+      <w:pPr>
+        <w:pStyle w:val="Heading2"/>
+        <w:spacing w:after="120" w:before="280"/>
+      </w:pPr>
+      <w:r>
+        <w:rPr>
+          <w:rFonts w:ascii="Arial" w:cs="Arial" w:eastAsia="Arial" w:hAnsi="Arial"/>
+          <w:b/>
+          <w:bCs/>
+          <w:color w:val="2E7D8C"/>
+          <w:sz w:val="28"/>
+          <w:szCs w:val="28"/>
+        </w:rPr>
+        <w:t xml:space="preserve">4.10 Environment Variables — Partnership Agent</w:t>
+      </w:r>
+    </w:p>
+    <w:p>
+      <w:pPr>
+        <w:spacing w:after="60" w:before="60"/>
+      </w:pPr>
+      <w:r>
+        <w:rPr>
+          <w:rFonts w:ascii="Courier New" w:cs="Courier New" w:eastAsia="Courier New" w:hAnsi="Courier New"/>
+          <w:color w:val="1A3557"/>
+          <w:sz w:val="17"/>
+          <w:szCs w:val="17"/>
+        </w:rPr>
+        <w:t xml:space="preserve"># .env additions for Partnership Agent
+PARTNER_AGENT_ENABLED=True
+PARTNER_AGENT_SCHEDULE='0 9 * * 1'   # Weekly Monday 9 AM
+PARTNER_FOLLOWUP_DAYS=30              # Days before flagging overdue follow-up
+# ANTHROPIC_API_KEY already set — web_search tool uses the same key
+# No additional API keys required for web search functionality</w:t>
+      </w:r>
+    </w:p>
+    <w:p>
+      <w:pPr>
+        <w:spacing w:after="60" w:before="60"/>
+      </w:pPr>
+      <w:r>
+        <w:rPr>
+          <w:rFonts w:ascii="Arial" w:cs="Arial" w:eastAsia="Arial" w:hAnsi="Arial"/>
+          <w:b/>
+          <w:bCs/>
+          <w:color w:val="2E7D8C"/>
+          <w:sz w:val="22"/>
+          <w:szCs w:val="22"/>
+        </w:rPr>
+        <w:t xml:space="preserve">Web Search Note: </w:t>
+      </w:r>
+      <w:r>
+        <w:rPr>
+          <w:rFonts w:ascii="Arial" w:cs="Arial" w:eastAsia="Arial" w:hAnsi="Arial"/>
+          <w:i/>
+          <w:iCs/>
+          <w:color w:val="1C1C1E"/>
+          <w:sz w:val="22"/>
+          <w:szCs w:val="22"/>
+        </w:rPr>
+        <w:t xml:space="preserve">The web_search tool is a built-in Anthropic tool (type: 'web_search_20250305') available on claude-sonnet-4-6. No additional API key or external search service is required. The tool is passed in the tools array of the messages.create() call exactly as shown in §4.6.</w:t>
+      </w:r>
+    </w:p>
     <w:p>
       <w:r>
         <w:br w:type="page"/>

</xml_diff>